<commit_message>
Band 4 und 5 rein pflanzlich, Tausch-Tipps in Band 3 ergänzt
Pflanzenwachs statt Bienenwachs, Mandelkleie statt Honig, Sheabutter statt
Lanolin; Trocknerbälle und Lanolin-Kur entfernt. Ostereier-Rezept mit
Tausch-Tipp für Stoff und Holzeier.

Co-Authored-By: Claude Opus 5.5 <noreply@anthropic.com>
Claude-Session: https://claude.ai/code/session_01Rqm6WzG9kWnhYjBnATSipi
</commit_message>
<xml_diff>
--- a/buecher/band-4-reinigung/Was-die-Natur-uns-schenkt-Band-4.docx
+++ b/buecher/band-4-reinigung/Was-die-Natur-uns-schenkt-Band-4.docx
@@ -491,7 +491,7 @@
       </w:r>
       <w:fldSimple w:instr="PAGEREF s_kueche \h">
         <w:r>
-          <w:t xml:space="preserve">21</w:t>
+          <w:t xml:space="preserve">20</w:t>
         </w:r>
       </w:fldSimple>
     </w:p>
@@ -517,7 +517,7 @@
       </w:r>
       <w:fldSimple w:instr="PAGEREF k_spuelen \h">
         <w:r>
-          <w:t xml:space="preserve">22</w:t>
+          <w:t xml:space="preserve">21</w:t>
         </w:r>
       </w:fldSimple>
     </w:p>
@@ -543,7 +543,7 @@
       </w:r>
       <w:fldSimple w:instr="PAGEREF k_backofen_herd \h">
         <w:r>
-          <w:t xml:space="preserve">24</w:t>
+          <w:t xml:space="preserve">23</w:t>
         </w:r>
       </w:fldSimple>
     </w:p>
@@ -569,7 +569,7 @@
       </w:r>
       <w:fldSimple w:instr="PAGEREF k_kuehlschrank_flaechen \h">
         <w:r>
-          <w:t xml:space="preserve">26</w:t>
+          <w:t xml:space="preserve">25</w:t>
         </w:r>
       </w:fldSimple>
     </w:p>
@@ -595,7 +595,7 @@
       </w:r>
       <w:fldSimple w:instr="PAGEREF s_bad \h">
         <w:r>
-          <w:t xml:space="preserve">28</w:t>
+          <w:t xml:space="preserve">27</w:t>
         </w:r>
       </w:fldSimple>
     </w:p>
@@ -621,7 +621,7 @@
       </w:r>
       <w:fldSimple w:instr="PAGEREF k_kalk_armaturen \h">
         <w:r>
-          <w:t xml:space="preserve">29</w:t>
+          <w:t xml:space="preserve">28</w:t>
         </w:r>
       </w:fldSimple>
     </w:p>
@@ -647,7 +647,7 @@
       </w:r>
       <w:fldSimple w:instr="PAGEREF k_wc_fugen_abfluss \h">
         <w:r>
-          <w:t xml:space="preserve">31</w:t>
+          <w:t xml:space="preserve">30</w:t>
         </w:r>
       </w:fldSimple>
     </w:p>
@@ -673,7 +673,7 @@
       </w:r>
       <w:fldSimple w:instr="PAGEREF s_wohnen \h">
         <w:r>
-          <w:t xml:space="preserve">33</w:t>
+          <w:t xml:space="preserve">32</w:t>
         </w:r>
       </w:fldSimple>
     </w:p>
@@ -699,7 +699,7 @@
       </w:r>
       <w:fldSimple w:instr="PAGEREF k_allzweck_boeden \h">
         <w:r>
-          <w:t xml:space="preserve">34</w:t>
+          <w:t xml:space="preserve">33</w:t>
         </w:r>
       </w:fldSimple>
     </w:p>
@@ -725,7 +725,7 @@
       </w:r>
       <w:fldSimple w:instr="PAGEREF k_fenster_glas \h">
         <w:r>
-          <w:t xml:space="preserve">36</w:t>
+          <w:t xml:space="preserve">35</w:t>
         </w:r>
       </w:fldSimple>
     </w:p>
@@ -751,7 +751,7 @@
       </w:r>
       <w:fldSimple w:instr="PAGEREF k_moebel_leder_metall \h">
         <w:r>
-          <w:t xml:space="preserve">37</w:t>
+          <w:t xml:space="preserve">36</w:t>
         </w:r>
       </w:fldSimple>
     </w:p>
@@ -777,7 +777,7 @@
       </w:r>
       <w:fldSimple w:instr="PAGEREF k_luft_schimmel \h">
         <w:r>
-          <w:t xml:space="preserve">39</w:t>
+          <w:t xml:space="preserve">38</w:t>
         </w:r>
       </w:fldSimple>
     </w:p>
@@ -803,7 +803,7 @@
       </w:r>
       <w:fldSimple w:instr="PAGEREF k_ungeziefer \h">
         <w:r>
-          <w:t xml:space="preserve">41</w:t>
+          <w:t xml:space="preserve">40</w:t>
         </w:r>
       </w:fldSimple>
     </w:p>
@@ -829,7 +829,7 @@
       </w:r>
       <w:fldSimple w:instr="PAGEREF s_routine \h">
         <w:r>
-          <w:t xml:space="preserve">43</w:t>
+          <w:t xml:space="preserve">42</w:t>
         </w:r>
       </w:fldSimple>
     </w:p>
@@ -855,7 +855,7 @@
       </w:r>
       <w:fldSimple w:instr="PAGEREF k_putzplan \h">
         <w:r>
-          <w:t xml:space="preserve">44</w:t>
+          <w:t xml:space="preserve">43</w:t>
         </w:r>
       </w:fldSimple>
     </w:p>
@@ -881,7 +881,7 @@
       </w:r>
       <w:fldSimple w:instr="PAGEREF t25 \h">
         <w:r>
-          <w:t xml:space="preserve">46</w:t>
+          <w:t xml:space="preserve">45</w:t>
         </w:r>
       </w:fldSimple>
     </w:p>
@@ -907,7 +907,7 @@
       </w:r>
       <w:fldSimple w:instr="PAGEREF t26 \h">
         <w:r>
-          <w:t xml:space="preserve">47</w:t>
+          <w:t xml:space="preserve">46</w:t>
         </w:r>
       </w:fldSimple>
     </w:p>
@@ -4542,7 +4542,7 @@
               <w:jc w:val="left"/>
             </w:pPr>
             <w:r>
-              <w:t xml:space="preserve">über Nacht in Milch oder Buttermilch einweichen, dann waschen; Reste mit Zitronensaft betupfen</w:t>
+              <w:t xml:space="preserve">frisch mit Zitronensaft betupfen, etwas Salz aufstreuen, 30 Minuten einwirken lassen, auswaschen; eingetrocknete Tinte geht mit Hausmitteln oft nicht mehr ganz heraus</w:t>
             </w:r>
           </w:p>
         </w:tc>
@@ -5652,11 +5652,185 @@
     </w:p>
     <w:p>
       <w:pPr>
+        <w:pStyle w:val="Heading2"/>
+      </w:pPr>
+      <w:r>
+        <w:t xml:space="preserve">Weiche Wäsche ohne Trockner</w:t>
+      </w:r>
+    </w:p>
+    <w:p>
+      <w:pPr>
+        <w:pStyle w:val="ListParagraph"/>
+        <w:numPr>
+          <w:ilvl w:val="0"/>
+          <w:numId w:val="2"/>
+        </w:numPr>
+        <w:spacing w:after="80" w:line="290"/>
+      </w:pPr>
+      <w:r>
+        <w:t xml:space="preserve">Wäsche nach dem Schleudern </w:t>
+      </w:r>
+      <w:r>
+        <w:rPr>
+          <w:b/>
+          <w:bCs/>
+        </w:rPr>
+        <w:t xml:space="preserve">kräftig ausschütteln</w:t>
+      </w:r>
+      <w:r>
+        <w:t xml:space="preserve"> und glatt ziehen, bevor du sie aufhängst.</w:t>
+      </w:r>
+    </w:p>
+    <w:p>
+      <w:pPr>
+        <w:pStyle w:val="ListParagraph"/>
+        <w:numPr>
+          <w:ilvl w:val="0"/>
+          <w:numId w:val="2"/>
+        </w:numPr>
+        <w:spacing w:after="80" w:line="290"/>
+      </w:pPr>
+      <w:r>
+        <w:rPr>
+          <w:b/>
+          <w:bCs/>
+        </w:rPr>
+        <w:t xml:space="preserve">Draußen bei Wind</w:t>
+      </w:r>
+      <w:r>
+        <w:t xml:space="preserve"> trocknet sie am weichsten; in der prallen Sonne wird Frottee eher hart.</w:t>
+      </w:r>
+    </w:p>
+    <w:p>
+      <w:pPr>
+        <w:pStyle w:val="ListParagraph"/>
+        <w:numPr>
+          <w:ilvl w:val="0"/>
+          <w:numId w:val="2"/>
+        </w:numPr>
+        <w:spacing w:after="80" w:line="290"/>
+      </w:pPr>
+      <w:r>
+        <w:t xml:space="preserve">Handtücher nach dem Trocknen kurz ausschlagen oder rubbeln – dann sind sie wieder flauschig.</w:t>
+      </w:r>
+    </w:p>
+    <w:p>
+      <w:pPr>
+        <w:pStyle w:val="ListParagraph"/>
+        <w:numPr>
+          <w:ilvl w:val="0"/>
+          <w:numId w:val="2"/>
+        </w:numPr>
+        <w:spacing w:after="80" w:line="290"/>
+      </w:pPr>
+      <w:r>
+        <w:t xml:space="preserve">Essig im Weichspülerfach (oben) löst Kalkreste, die Wäsche steif machen.</w:t>
+      </w:r>
+    </w:p>
+    <w:p>
+      <w:pPr>
+        <w:pStyle w:val="Heading1"/>
+        <w:pageBreakBefore/>
+      </w:pPr>
+      <w:bookmarkStart w:name="k_wolle_feines" w:id="1"/>
+      <w:r>
+        <w:t xml:space="preserve">Wolle, Seide und Feines</w:t>
+      </w:r>
+      <w:bookmarkEnd w:id="1"/>
+    </w:p>
+    <w:p>
+      <w:pPr>
+        <w:spacing w:after="140" w:line="300"/>
+        <w:jc w:val="both"/>
+      </w:pPr>
+      <w:r>
+        <w:t xml:space="preserve">Wolle und Seide sind Eiweißfasern – wie unser Haar. Sie vertragen </w:t>
+      </w:r>
+      <w:r>
+        <w:rPr>
+          <w:b/>
+          <w:bCs/>
+        </w:rPr>
+        <w:t xml:space="preserve">keine Basen</w:t>
+      </w:r>
+      <w:r>
+        <w:t xml:space="preserve"> wie Natron und keine Hitze. Am besten wäscht man sie mild, lauwarm und von Hand.</w:t>
+      </w:r>
+    </w:p>
+    <w:p>
+      <w:pPr>
+        <w:pStyle w:val="Heading2"/>
+      </w:pPr>
+      <w:r>
+        <w:t xml:space="preserve">Grundregeln</w:t>
+      </w:r>
+    </w:p>
+    <w:p>
+      <w:pPr>
+        <w:pStyle w:val="ListParagraph"/>
+        <w:numPr>
+          <w:ilvl w:val="0"/>
+          <w:numId w:val="2"/>
+        </w:numPr>
+        <w:spacing w:after="80" w:line="290"/>
+      </w:pPr>
+      <w:r>
+        <w:t xml:space="preserve">Lauwarm (höchstens 30 °C), nicht kalt und warm abwechselnd – Temperaturwechsel lässt Wolle verfilzen.</w:t>
+      </w:r>
+    </w:p>
+    <w:p>
+      <w:pPr>
+        <w:pStyle w:val="ListParagraph"/>
+        <w:numPr>
+          <w:ilvl w:val="0"/>
+          <w:numId w:val="2"/>
+        </w:numPr>
+        <w:spacing w:after="80" w:line="290"/>
+      </w:pPr>
+      <w:r>
+        <w:rPr>
+          <w:b/>
+          <w:bCs/>
+        </w:rPr>
+        <w:t xml:space="preserve">Nicht reiben, nicht wringen</w:t>
+      </w:r>
+      <w:r>
+        <w:t xml:space="preserve"> – sanft durchdrücken.</w:t>
+      </w:r>
+    </w:p>
+    <w:p>
+      <w:pPr>
+        <w:pStyle w:val="ListParagraph"/>
+        <w:numPr>
+          <w:ilvl w:val="0"/>
+          <w:numId w:val="2"/>
+        </w:numPr>
+        <w:spacing w:after="80" w:line="290"/>
+      </w:pPr>
+      <w:r>
+        <w:t xml:space="preserve">Liegend auf einem Handtuch trocknen, nicht in der Sonne oder auf der Heizung.</w:t>
+      </w:r>
+    </w:p>
+    <w:p>
+      <w:pPr>
+        <w:pStyle w:val="ListParagraph"/>
+        <w:numPr>
+          <w:ilvl w:val="0"/>
+          <w:numId w:val="2"/>
+        </w:numPr>
+        <w:spacing w:after="80" w:line="290"/>
+      </w:pPr>
+      <w:r>
+        <w:t xml:space="preserve">Wolle muss nicht oft gewaschen werden: Auslüften reicht meist.</w:t>
+      </w:r>
+    </w:p>
+    <w:p>
+      <w:pPr>
         <w:pStyle w:val="Heading3"/>
       </w:pPr>
       <w:bookmarkStart w:name="r9" w:id="1"/>
       <w:r>
-        <w:t xml:space="preserve">Waschbälle und Trocknerbälle aus Wolle</w:t>
+        <w:t xml:space="preserve">Mildes Woll- und Feinwaschmittel</w:t>
       </w:r>
       <w:bookmarkEnd w:id="1"/>
     </w:p>
@@ -5670,7 +5844,7 @@
           <w:i/>
           <w:iCs/>
         </w:rPr>
-        <w:t xml:space="preserve">Ersetzen Weichspüler im Trockner</w:t>
+        <w:t xml:space="preserve">Für eine Handwäsche</w:t>
       </w:r>
     </w:p>
     <w:p>
@@ -5695,7 +5869,7 @@
         <w:spacing w:after="80" w:line="290"/>
       </w:pPr>
       <w:r>
-        <w:t xml:space="preserve">reine Schafwolle (Märchenwolle) oder Wollreste, die filzen</w:t>
+        <w:t xml:space="preserve">5 Liter lauwarmes Wasser</w:t>
       </w:r>
     </w:p>
     <w:p>
@@ -5708,7 +5882,20 @@
         <w:spacing w:after="80" w:line="290"/>
       </w:pPr>
       <w:r>
-        <w:t xml:space="preserve">alter Nylonstrumpf</w:t>
+        <w:t xml:space="preserve">100 ml Seifenkrautsud (Band 1) oder Waschnusssud (Kapitel Spülen)</w:t>
+      </w:r>
+    </w:p>
+    <w:p>
+      <w:pPr>
+        <w:pStyle w:val="ListParagraph"/>
+        <w:numPr>
+          <w:ilvl w:val="0"/>
+          <w:numId w:val="2"/>
+        </w:numPr>
+        <w:spacing w:after="80" w:line="290"/>
+      </w:pPr>
+      <w:r>
+        <w:t xml:space="preserve">für die Spülung: 1 Schuss Essig</w:t>
       </w:r>
     </w:p>
     <w:p>
@@ -5733,7 +5920,7 @@
         <w:spacing w:after="80" w:line="290"/>
       </w:pPr>
       <w:r>
-        <w:t xml:space="preserve">Wolle zu einer festen Kugel wickeln (etwa tennisballgroß).</w:t>
+        <w:t xml:space="preserve">Sud ins Wasser geben und verrühren.</w:t>
       </w:r>
     </w:p>
     <w:p>
@@ -5746,7 +5933,7 @@
         <w:spacing w:after="80" w:line="290"/>
       </w:pPr>
       <w:r>
-        <w:t xml:space="preserve">In den Nylonstrumpf stecken, Strumpf zwischen mehreren Kugeln abbinden.</w:t>
+        <w:t xml:space="preserve">Kleidungsstück 10 Minuten einweichen, sanft durchdrücken.</w:t>
       </w:r>
     </w:p>
     <w:p>
@@ -5759,7 +5946,7 @@
         <w:spacing w:after="80" w:line="290"/>
       </w:pPr>
       <w:r>
-        <w:t xml:space="preserve">Bei 60 °C mit Handtüchern waschen und im Trockner trocknen – die Kugeln verfilzen fest.</w:t>
+        <w:t xml:space="preserve">In lauwarmem Wasser spülen, im letzten Spülwasser einen Schuss Essig – er macht die Fasern geschmeidig.</w:t>
       </w:r>
     </w:p>
     <w:p>
@@ -5772,380 +5959,7 @@
         <w:spacing w:after="80" w:line="290"/>
       </w:pPr>
       <w:r>
-        <w:t xml:space="preserve">Aus dem Strumpf nehmen. 3 bis 4 Bälle mit in den Trockner geben – sie lockern die Wäsche auf und verkürzen die Trockenzeit.</w:t>
-      </w:r>
-    </w:p>
-    <w:p>
-      <w:pPr>
-        <w:pStyle w:val="Heading1"/>
-        <w:pageBreakBefore/>
-      </w:pPr>
-      <w:bookmarkStart w:name="k_wolle_feines" w:id="1"/>
-      <w:r>
-        <w:t xml:space="preserve">Wolle, Seide und Feines</w:t>
-      </w:r>
-      <w:bookmarkEnd w:id="1"/>
-    </w:p>
-    <w:p>
-      <w:pPr>
-        <w:spacing w:after="140" w:line="300"/>
-        <w:jc w:val="both"/>
-      </w:pPr>
-      <w:r>
-        <w:t xml:space="preserve">Wolle und Seide sind Eiweißfasern – wie unser Haar. Sie vertragen </w:t>
-      </w:r>
-      <w:r>
-        <w:rPr>
-          <w:b/>
-          <w:bCs/>
-        </w:rPr>
-        <w:t xml:space="preserve">keine Basen</w:t>
-      </w:r>
-      <w:r>
-        <w:t xml:space="preserve"> wie Natron und keine Hitze. Am besten wäscht man sie mild, lauwarm und von Hand.</w:t>
-      </w:r>
-    </w:p>
-    <w:p>
-      <w:pPr>
-        <w:pStyle w:val="Heading2"/>
-      </w:pPr>
-      <w:r>
-        <w:t xml:space="preserve">Grundregeln</w:t>
-      </w:r>
-    </w:p>
-    <w:p>
-      <w:pPr>
-        <w:pStyle w:val="ListParagraph"/>
-        <w:numPr>
-          <w:ilvl w:val="0"/>
-          <w:numId w:val="2"/>
-        </w:numPr>
-        <w:spacing w:after="80" w:line="290"/>
-      </w:pPr>
-      <w:r>
-        <w:t xml:space="preserve">Lauwarm (höchstens 30 °C), nicht kalt und warm abwechselnd – Temperaturwechsel lässt Wolle verfilzen.</w:t>
-      </w:r>
-    </w:p>
-    <w:p>
-      <w:pPr>
-        <w:pStyle w:val="ListParagraph"/>
-        <w:numPr>
-          <w:ilvl w:val="0"/>
-          <w:numId w:val="2"/>
-        </w:numPr>
-        <w:spacing w:after="80" w:line="290"/>
-      </w:pPr>
-      <w:r>
-        <w:rPr>
-          <w:b/>
-          <w:bCs/>
-        </w:rPr>
-        <w:t xml:space="preserve">Nicht reiben, nicht wringen</w:t>
-      </w:r>
-      <w:r>
-        <w:t xml:space="preserve"> – sanft durchdrücken.</w:t>
-      </w:r>
-    </w:p>
-    <w:p>
-      <w:pPr>
-        <w:pStyle w:val="ListParagraph"/>
-        <w:numPr>
-          <w:ilvl w:val="0"/>
-          <w:numId w:val="2"/>
-        </w:numPr>
-        <w:spacing w:after="80" w:line="290"/>
-      </w:pPr>
-      <w:r>
-        <w:t xml:space="preserve">Liegend auf einem Handtuch trocknen, nicht in der Sonne oder auf der Heizung.</w:t>
-      </w:r>
-    </w:p>
-    <w:p>
-      <w:pPr>
-        <w:pStyle w:val="ListParagraph"/>
-        <w:numPr>
-          <w:ilvl w:val="0"/>
-          <w:numId w:val="2"/>
-        </w:numPr>
-        <w:spacing w:after="80" w:line="290"/>
-      </w:pPr>
-      <w:r>
-        <w:t xml:space="preserve">Wolle muss nicht oft gewaschen werden: Auslüften reicht meist.</w:t>
-      </w:r>
-    </w:p>
-    <w:p>
-      <w:pPr>
-        <w:pStyle w:val="Heading3"/>
-      </w:pPr>
-      <w:bookmarkStart w:name="r10" w:id="1"/>
-      <w:r>
-        <w:t xml:space="preserve">Mildes Woll- und Feinwaschmittel</w:t>
-      </w:r>
-      <w:bookmarkEnd w:id="1"/>
-    </w:p>
-    <w:p>
-      <w:pPr>
-        <w:spacing w:after="140" w:line="300"/>
-        <w:jc w:val="left"/>
-      </w:pPr>
-      <w:r>
-        <w:rPr>
-          <w:i/>
-          <w:iCs/>
-        </w:rPr>
-        <w:t xml:space="preserve">Für eine Handwäsche</w:t>
-      </w:r>
-    </w:p>
-    <w:p>
-      <w:pPr>
-        <w:spacing w:after="60"/>
-      </w:pPr>
-      <w:r>
-        <w:rPr>
-          <w:b/>
-          <w:bCs/>
-        </w:rPr>
-        <w:t xml:space="preserve">Du brauchst</w:t>
-      </w:r>
-    </w:p>
-    <w:p>
-      <w:pPr>
-        <w:pStyle w:val="ListParagraph"/>
-        <w:numPr>
-          <w:ilvl w:val="0"/>
-          <w:numId w:val="2"/>
-        </w:numPr>
-        <w:spacing w:after="80" w:line="290"/>
-      </w:pPr>
-      <w:r>
-        <w:t xml:space="preserve">5 Liter lauwarmes Wasser</w:t>
-      </w:r>
-    </w:p>
-    <w:p>
-      <w:pPr>
-        <w:pStyle w:val="ListParagraph"/>
-        <w:numPr>
-          <w:ilvl w:val="0"/>
-          <w:numId w:val="2"/>
-        </w:numPr>
-        <w:spacing w:after="80" w:line="290"/>
-      </w:pPr>
-      <w:r>
-        <w:t xml:space="preserve">100 ml Seifenkrautsud (Band 1) oder Waschnusssud (Kapitel Spülen)</w:t>
-      </w:r>
-    </w:p>
-    <w:p>
-      <w:pPr>
-        <w:pStyle w:val="ListParagraph"/>
-        <w:numPr>
-          <w:ilvl w:val="0"/>
-          <w:numId w:val="2"/>
-        </w:numPr>
-        <w:spacing w:after="80" w:line="290"/>
-      </w:pPr>
-      <w:r>
-        <w:t xml:space="preserve">für die Spülung: 1 Schuss Essig</w:t>
-      </w:r>
-    </w:p>
-    <w:p>
-      <w:pPr>
-        <w:spacing w:after="60" w:before="120"/>
-      </w:pPr>
-      <w:r>
-        <w:rPr>
-          <w:b/>
-          <w:bCs/>
-        </w:rPr>
-        <w:t xml:space="preserve">So geht es</w:t>
-      </w:r>
-    </w:p>
-    <w:p>
-      <w:pPr>
-        <w:pStyle w:val="ListParagraph"/>
-        <w:numPr>
-          <w:ilvl w:val="0"/>
-          <w:numId w:val="12"/>
-        </w:numPr>
-        <w:spacing w:after="80" w:line="290"/>
-      </w:pPr>
-      <w:r>
-        <w:t xml:space="preserve">Sud ins Wasser geben und verrühren.</w:t>
-      </w:r>
-    </w:p>
-    <w:p>
-      <w:pPr>
-        <w:pStyle w:val="ListParagraph"/>
-        <w:numPr>
-          <w:ilvl w:val="0"/>
-          <w:numId w:val="12"/>
-        </w:numPr>
-        <w:spacing w:after="80" w:line="290"/>
-      </w:pPr>
-      <w:r>
-        <w:t xml:space="preserve">Kleidungsstück 10 Minuten einweichen, sanft durchdrücken.</w:t>
-      </w:r>
-    </w:p>
-    <w:p>
-      <w:pPr>
-        <w:pStyle w:val="ListParagraph"/>
-        <w:numPr>
-          <w:ilvl w:val="0"/>
-          <w:numId w:val="12"/>
-        </w:numPr>
-        <w:spacing w:after="80" w:line="290"/>
-      </w:pPr>
-      <w:r>
-        <w:t xml:space="preserve">In lauwarmem Wasser spülen, im letzten Spülwasser einen Schuss Essig – er macht die Fasern geschmeidig.</w:t>
-      </w:r>
-    </w:p>
-    <w:p>
-      <w:pPr>
-        <w:pStyle w:val="ListParagraph"/>
-        <w:numPr>
-          <w:ilvl w:val="0"/>
-          <w:numId w:val="12"/>
-        </w:numPr>
-        <w:spacing w:after="80" w:line="290"/>
-      </w:pPr>
-      <w:r>
         <w:t xml:space="preserve">Wasser vorsichtig herausdrücken, in ein Handtuch einrollen und ausdrücken, liegend trocknen.</w:t>
-      </w:r>
-    </w:p>
-    <w:p>
-      <w:pPr>
-        <w:pStyle w:val="Heading3"/>
-      </w:pPr>
-      <w:bookmarkStart w:name="r11" w:id="1"/>
-      <w:r>
-        <w:t xml:space="preserve">Lanolin-Kur für Wolle (Wollwalk, Windeln)</w:t>
-      </w:r>
-      <w:bookmarkEnd w:id="1"/>
-    </w:p>
-    <w:p>
-      <w:pPr>
-        <w:spacing w:after="140" w:line="300"/>
-        <w:jc w:val="left"/>
-      </w:pPr>
-      <w:r>
-        <w:rPr>
-          <w:i/>
-          <w:iCs/>
-        </w:rPr>
-        <w:t xml:space="preserve">Macht Wolle wieder wasserabweisend</w:t>
-      </w:r>
-    </w:p>
-    <w:p>
-      <w:pPr>
-        <w:spacing w:after="60"/>
-      </w:pPr>
-      <w:r>
-        <w:rPr>
-          <w:b/>
-          <w:bCs/>
-        </w:rPr>
-        <w:t xml:space="preserve">Du brauchst</w:t>
-      </w:r>
-    </w:p>
-    <w:p>
-      <w:pPr>
-        <w:pStyle w:val="ListParagraph"/>
-        <w:numPr>
-          <w:ilvl w:val="0"/>
-          <w:numId w:val="2"/>
-        </w:numPr>
-        <w:spacing w:after="80" w:line="290"/>
-      </w:pPr>
-      <w:r>
-        <w:t xml:space="preserve">1 TL reines Lanolin (Wollfett, Apotheke)</w:t>
-      </w:r>
-    </w:p>
-    <w:p>
-      <w:pPr>
-        <w:pStyle w:val="ListParagraph"/>
-        <w:numPr>
-          <w:ilvl w:val="0"/>
-          <w:numId w:val="2"/>
-        </w:numPr>
-        <w:spacing w:after="80" w:line="290"/>
-      </w:pPr>
-      <w:r>
-        <w:t xml:space="preserve">ein Glas heißes Wasser, 1 EL Seifenkraut- oder Waschnusssud</w:t>
-      </w:r>
-    </w:p>
-    <w:p>
-      <w:pPr>
-        <w:pStyle w:val="ListParagraph"/>
-        <w:numPr>
-          <w:ilvl w:val="0"/>
-          <w:numId w:val="2"/>
-        </w:numPr>
-        <w:spacing w:after="80" w:line="290"/>
-      </w:pPr>
-      <w:r>
-        <w:t xml:space="preserve">Schüssel mit lauwarmem Wasser</w:t>
-      </w:r>
-    </w:p>
-    <w:p>
-      <w:pPr>
-        <w:spacing w:after="60" w:before="120"/>
-      </w:pPr>
-      <w:r>
-        <w:rPr>
-          <w:b/>
-          <w:bCs/>
-        </w:rPr>
-        <w:t xml:space="preserve">So geht es</w:t>
-      </w:r>
-    </w:p>
-    <w:p>
-      <w:pPr>
-        <w:pStyle w:val="ListParagraph"/>
-        <w:numPr>
-          <w:ilvl w:val="0"/>
-          <w:numId w:val="13"/>
-        </w:numPr>
-        <w:spacing w:after="80" w:line="290"/>
-      </w:pPr>
-      <w:r>
-        <w:t xml:space="preserve">Lanolin mit dem Sud im heißen Wasser verrühren, bis es milchig ist.</w:t>
-      </w:r>
-    </w:p>
-    <w:p>
-      <w:pPr>
-        <w:pStyle w:val="ListParagraph"/>
-        <w:numPr>
-          <w:ilvl w:val="0"/>
-          <w:numId w:val="13"/>
-        </w:numPr>
-        <w:spacing w:after="80" w:line="290"/>
-      </w:pPr>
-      <w:r>
-        <w:t xml:space="preserve">In die Schüssel mit lauwarmem Wasser geben.</w:t>
-      </w:r>
-    </w:p>
-    <w:p>
-      <w:pPr>
-        <w:pStyle w:val="ListParagraph"/>
-        <w:numPr>
-          <w:ilvl w:val="0"/>
-          <w:numId w:val="13"/>
-        </w:numPr>
-        <w:spacing w:after="80" w:line="290"/>
-      </w:pPr>
-      <w:r>
-        <w:t xml:space="preserve">Gewaschene Wolle einlegen und 1 bis 2 Stunden ziehen lassen, nicht ausspülen.</w:t>
-      </w:r>
-    </w:p>
-    <w:p>
-      <w:pPr>
-        <w:pStyle w:val="ListParagraph"/>
-        <w:numPr>
-          <w:ilvl w:val="0"/>
-          <w:numId w:val="13"/>
-        </w:numPr>
-        <w:spacing w:after="80" w:line="290"/>
-      </w:pPr>
-      <w:r>
-        <w:t xml:space="preserve">Vorsichtig ausdrücken und liegend trocknen.</w:t>
       </w:r>
     </w:p>
     <w:p>
@@ -6275,7 +6089,7 @@
       <w:pPr>
         <w:pStyle w:val="Heading3"/>
       </w:pPr>
-      <w:bookmarkStart w:name="r12" w:id="1"/>
+      <w:bookmarkStart w:name="r10" w:id="1"/>
       <w:r>
         <w:t xml:space="preserve">Spülmittel aus Waschnüssen</w:t>
       </w:r>
@@ -6362,7 +6176,7 @@
         <w:pStyle w:val="ListParagraph"/>
         <w:numPr>
           <w:ilvl w:val="0"/>
-          <w:numId w:val="14"/>
+          <w:numId w:val="12"/>
         </w:numPr>
         <w:spacing w:after="80" w:line="290"/>
       </w:pPr>
@@ -6375,7 +6189,7 @@
         <w:pStyle w:val="ListParagraph"/>
         <w:numPr>
           <w:ilvl w:val="0"/>
-          <w:numId w:val="14"/>
+          <w:numId w:val="12"/>
         </w:numPr>
         <w:spacing w:after="80" w:line="290"/>
       </w:pPr>
@@ -6388,7 +6202,7 @@
         <w:pStyle w:val="ListParagraph"/>
         <w:numPr>
           <w:ilvl w:val="0"/>
-          <w:numId w:val="14"/>
+          <w:numId w:val="12"/>
         </w:numPr>
         <w:spacing w:after="80" w:line="290"/>
       </w:pPr>
@@ -6413,7 +6227,7 @@
       <w:pPr>
         <w:pStyle w:val="Heading3"/>
       </w:pPr>
-      <w:bookmarkStart w:name="r13" w:id="1"/>
+      <w:bookmarkStart w:name="r11" w:id="1"/>
       <w:r>
         <w:t xml:space="preserve">Spülmittel aus Efeu oder Kastanien</w:t>
       </w:r>
@@ -6474,7 +6288,7 @@
         <w:pStyle w:val="ListParagraph"/>
         <w:numPr>
           <w:ilvl w:val="0"/>
-          <w:numId w:val="15"/>
+          <w:numId w:val="13"/>
         </w:numPr>
         <w:spacing w:after="80" w:line="290"/>
       </w:pPr>
@@ -6487,7 +6301,7 @@
         <w:pStyle w:val="ListParagraph"/>
         <w:numPr>
           <w:ilvl w:val="0"/>
-          <w:numId w:val="15"/>
+          <w:numId w:val="13"/>
         </w:numPr>
         <w:spacing w:after="80" w:line="290"/>
       </w:pPr>
@@ -6500,7 +6314,7 @@
         <w:pStyle w:val="ListParagraph"/>
         <w:numPr>
           <w:ilvl w:val="0"/>
-          <w:numId w:val="15"/>
+          <w:numId w:val="13"/>
         </w:numPr>
         <w:spacing w:after="80" w:line="290"/>
       </w:pPr>
@@ -6680,7 +6494,7 @@
       <w:pPr>
         <w:pStyle w:val="Heading3"/>
       </w:pPr>
-      <w:bookmarkStart w:name="r14" w:id="1"/>
+      <w:bookmarkStart w:name="r12" w:id="1"/>
       <w:r>
         <w:t xml:space="preserve">Spülmaschinenpulver aus Natron und Salz</w:t>
       </w:r>
@@ -6780,7 +6594,7 @@
         <w:pStyle w:val="ListParagraph"/>
         <w:numPr>
           <w:ilvl w:val="0"/>
-          <w:numId w:val="16"/>
+          <w:numId w:val="14"/>
         </w:numPr>
         <w:spacing w:after="80" w:line="290"/>
       </w:pPr>
@@ -6793,7 +6607,7 @@
         <w:pStyle w:val="ListParagraph"/>
         <w:numPr>
           <w:ilvl w:val="0"/>
-          <w:numId w:val="16"/>
+          <w:numId w:val="14"/>
         </w:numPr>
         <w:spacing w:after="80" w:line="290"/>
       </w:pPr>
@@ -6806,7 +6620,7 @@
         <w:pStyle w:val="ListParagraph"/>
         <w:numPr>
           <w:ilvl w:val="0"/>
-          <w:numId w:val="16"/>
+          <w:numId w:val="14"/>
         </w:numPr>
         <w:spacing w:after="80" w:line="290"/>
       </w:pPr>
@@ -6819,7 +6633,7 @@
         <w:pStyle w:val="ListParagraph"/>
         <w:numPr>
           <w:ilvl w:val="0"/>
-          <w:numId w:val="16"/>
+          <w:numId w:val="14"/>
         </w:numPr>
         <w:spacing w:after="80" w:line="290"/>
       </w:pPr>
@@ -6902,7 +6716,7 @@
       <w:pPr>
         <w:pStyle w:val="Heading3"/>
       </w:pPr>
-      <w:bookmarkStart w:name="r15" w:id="1"/>
+      <w:bookmarkStart w:name="r13" w:id="1"/>
       <w:r>
         <w:t xml:space="preserve">Backofen reinigen mit Natronpaste</w:t>
       </w:r>
@@ -7002,7 +6816,7 @@
         <w:pStyle w:val="ListParagraph"/>
         <w:numPr>
           <w:ilvl w:val="0"/>
-          <w:numId w:val="17"/>
+          <w:numId w:val="15"/>
         </w:numPr>
         <w:spacing w:after="80" w:line="290"/>
       </w:pPr>
@@ -7015,7 +6829,7 @@
         <w:pStyle w:val="ListParagraph"/>
         <w:numPr>
           <w:ilvl w:val="0"/>
-          <w:numId w:val="17"/>
+          <w:numId w:val="15"/>
         </w:numPr>
         <w:spacing w:after="80" w:line="290"/>
       </w:pPr>
@@ -7028,7 +6842,7 @@
         <w:pStyle w:val="ListParagraph"/>
         <w:numPr>
           <w:ilvl w:val="0"/>
-          <w:numId w:val="17"/>
+          <w:numId w:val="15"/>
         </w:numPr>
         <w:spacing w:after="80" w:line="290"/>
       </w:pPr>
@@ -7041,7 +6855,7 @@
         <w:pStyle w:val="ListParagraph"/>
         <w:numPr>
           <w:ilvl w:val="0"/>
-          <w:numId w:val="17"/>
+          <w:numId w:val="15"/>
         </w:numPr>
         <w:spacing w:after="80" w:line="290"/>
       </w:pPr>
@@ -7054,7 +6868,7 @@
         <w:pStyle w:val="ListParagraph"/>
         <w:numPr>
           <w:ilvl w:val="0"/>
-          <w:numId w:val="17"/>
+          <w:numId w:val="15"/>
         </w:numPr>
         <w:spacing w:after="80" w:line="290"/>
       </w:pPr>
@@ -7079,7 +6893,7 @@
       <w:pPr>
         <w:pStyle w:val="Heading3"/>
       </w:pPr>
-      <w:bookmarkStart w:name="r16" w:id="1"/>
+      <w:bookmarkStart w:name="r14" w:id="1"/>
       <w:r>
         <w:t xml:space="preserve">Backofenscheibe mit Natron und Glasschaber</w:t>
       </w:r>
@@ -7166,7 +6980,7 @@
         <w:pStyle w:val="ListParagraph"/>
         <w:numPr>
           <w:ilvl w:val="0"/>
-          <w:numId w:val="18"/>
+          <w:numId w:val="16"/>
         </w:numPr>
         <w:spacing w:after="80" w:line="290"/>
       </w:pPr>
@@ -7179,7 +6993,7 @@
         <w:pStyle w:val="ListParagraph"/>
         <w:numPr>
           <w:ilvl w:val="0"/>
-          <w:numId w:val="18"/>
+          <w:numId w:val="16"/>
         </w:numPr>
         <w:spacing w:after="80" w:line="290"/>
       </w:pPr>
@@ -7192,7 +7006,7 @@
         <w:pStyle w:val="ListParagraph"/>
         <w:numPr>
           <w:ilvl w:val="0"/>
-          <w:numId w:val="18"/>
+          <w:numId w:val="16"/>
         </w:numPr>
         <w:spacing w:after="80" w:line="290"/>
       </w:pPr>
@@ -7268,7 +7082,7 @@
       <w:pPr>
         <w:pStyle w:val="Heading3"/>
       </w:pPr>
-      <w:bookmarkStart w:name="r17" w:id="1"/>
+      <w:bookmarkStart w:name="r15" w:id="1"/>
       <w:r>
         <w:t xml:space="preserve">Mikrowelle in 5 Minuten</w:t>
       </w:r>
@@ -7342,7 +7156,7 @@
         <w:pStyle w:val="ListParagraph"/>
         <w:numPr>
           <w:ilvl w:val="0"/>
-          <w:numId w:val="19"/>
+          <w:numId w:val="17"/>
         </w:numPr>
         <w:spacing w:after="80" w:line="290"/>
       </w:pPr>
@@ -7355,7 +7169,7 @@
         <w:pStyle w:val="ListParagraph"/>
         <w:numPr>
           <w:ilvl w:val="0"/>
-          <w:numId w:val="19"/>
+          <w:numId w:val="17"/>
         </w:numPr>
         <w:spacing w:after="80" w:line="290"/>
       </w:pPr>
@@ -7368,7 +7182,7 @@
         <w:pStyle w:val="ListParagraph"/>
         <w:numPr>
           <w:ilvl w:val="0"/>
-          <w:numId w:val="19"/>
+          <w:numId w:val="17"/>
         </w:numPr>
         <w:spacing w:after="80" w:line="290"/>
       </w:pPr>
@@ -7381,7 +7195,7 @@
         <w:pStyle w:val="ListParagraph"/>
         <w:numPr>
           <w:ilvl w:val="0"/>
-          <w:numId w:val="19"/>
+          <w:numId w:val="17"/>
         </w:numPr>
         <w:spacing w:after="80" w:line="290"/>
       </w:pPr>
@@ -7421,7 +7235,7 @@
       <w:pPr>
         <w:pStyle w:val="Heading3"/>
       </w:pPr>
-      <w:bookmarkStart w:name="r18" w:id="1"/>
+      <w:bookmarkStart w:name="r16" w:id="1"/>
       <w:r>
         <w:t xml:space="preserve">Kühlschrank auswischen</w:t>
       </w:r>
@@ -7508,7 +7322,7 @@
         <w:pStyle w:val="ListParagraph"/>
         <w:numPr>
           <w:ilvl w:val="0"/>
-          <w:numId w:val="20"/>
+          <w:numId w:val="18"/>
         </w:numPr>
         <w:spacing w:after="80" w:line="290"/>
       </w:pPr>
@@ -7521,7 +7335,7 @@
         <w:pStyle w:val="ListParagraph"/>
         <w:numPr>
           <w:ilvl w:val="0"/>
-          <w:numId w:val="20"/>
+          <w:numId w:val="18"/>
         </w:numPr>
         <w:spacing w:after="80" w:line="290"/>
       </w:pPr>
@@ -7534,7 +7348,7 @@
         <w:pStyle w:val="ListParagraph"/>
         <w:numPr>
           <w:ilvl w:val="0"/>
-          <w:numId w:val="20"/>
+          <w:numId w:val="18"/>
         </w:numPr>
         <w:spacing w:after="80" w:line="290"/>
       </w:pPr>
@@ -7547,7 +7361,7 @@
         <w:pStyle w:val="ListParagraph"/>
         <w:numPr>
           <w:ilvl w:val="0"/>
-          <w:numId w:val="20"/>
+          <w:numId w:val="18"/>
         </w:numPr>
         <w:spacing w:after="80" w:line="290"/>
       </w:pPr>
@@ -8048,7 +7862,7 @@
       <w:pPr>
         <w:pStyle w:val="Heading3"/>
       </w:pPr>
-      <w:bookmarkStart w:name="r19" w:id="1"/>
+      <w:bookmarkStart w:name="r17" w:id="1"/>
       <w:r>
         <w:t xml:space="preserve">Allzweckspray für die Küche</w:t>
       </w:r>
@@ -8135,7 +7949,7 @@
         <w:pStyle w:val="ListParagraph"/>
         <w:numPr>
           <w:ilvl w:val="0"/>
-          <w:numId w:val="21"/>
+          <w:numId w:val="19"/>
         </w:numPr>
         <w:spacing w:after="80" w:line="290"/>
       </w:pPr>
@@ -8148,7 +7962,7 @@
         <w:pStyle w:val="ListParagraph"/>
         <w:numPr>
           <w:ilvl w:val="0"/>
-          <w:numId w:val="21"/>
+          <w:numId w:val="19"/>
         </w:numPr>
         <w:spacing w:after="80" w:line="290"/>
       </w:pPr>
@@ -8254,7 +8068,7 @@
       <w:pPr>
         <w:pStyle w:val="Heading3"/>
       </w:pPr>
-      <w:bookmarkStart w:name="r20" w:id="1"/>
+      <w:bookmarkStart w:name="r18" w:id="1"/>
       <w:r>
         <w:t xml:space="preserve">Spüllappen aus alten T-Shirts</w:t>
       </w:r>
@@ -8328,7 +8142,7 @@
         <w:pStyle w:val="ListParagraph"/>
         <w:numPr>
           <w:ilvl w:val="0"/>
-          <w:numId w:val="22"/>
+          <w:numId w:val="20"/>
         </w:numPr>
         <w:spacing w:after="80" w:line="290"/>
       </w:pPr>
@@ -8341,7 +8155,7 @@
         <w:pStyle w:val="ListParagraph"/>
         <w:numPr>
           <w:ilvl w:val="0"/>
-          <w:numId w:val="22"/>
+          <w:numId w:val="20"/>
         </w:numPr>
         <w:spacing w:after="80" w:line="290"/>
       </w:pPr>
@@ -8354,7 +8168,7 @@
         <w:pStyle w:val="ListParagraph"/>
         <w:numPr>
           <w:ilvl w:val="0"/>
-          <w:numId w:val="22"/>
+          <w:numId w:val="20"/>
         </w:numPr>
         <w:spacing w:after="80" w:line="290"/>
       </w:pPr>
@@ -8432,7 +8246,7 @@
       <w:pPr>
         <w:pStyle w:val="Heading3"/>
       </w:pPr>
-      <w:bookmarkStart w:name="r21" w:id="1"/>
+      <w:bookmarkStart w:name="r19" w:id="1"/>
       <w:r>
         <w:t xml:space="preserve">Kalklöser-Spray</w:t>
       </w:r>
@@ -8532,7 +8346,7 @@
         <w:pStyle w:val="ListParagraph"/>
         <w:numPr>
           <w:ilvl w:val="0"/>
-          <w:numId w:val="23"/>
+          <w:numId w:val="21"/>
         </w:numPr>
         <w:spacing w:after="80" w:line="290"/>
       </w:pPr>
@@ -8555,7 +8369,7 @@
         <w:pStyle w:val="ListParagraph"/>
         <w:numPr>
           <w:ilvl w:val="0"/>
-          <w:numId w:val="23"/>
+          <w:numId w:val="21"/>
         </w:numPr>
         <w:spacing w:after="80" w:line="290"/>
       </w:pPr>
@@ -8568,7 +8382,7 @@
         <w:pStyle w:val="ListParagraph"/>
         <w:numPr>
           <w:ilvl w:val="0"/>
-          <w:numId w:val="23"/>
+          <w:numId w:val="21"/>
         </w:numPr>
         <w:spacing w:after="80" w:line="290"/>
       </w:pPr>
@@ -8593,7 +8407,7 @@
       <w:pPr>
         <w:pStyle w:val="Heading3"/>
       </w:pPr>
-      <w:bookmarkStart w:name="r22" w:id="1"/>
+      <w:bookmarkStart w:name="r20" w:id="1"/>
       <w:r>
         <w:t xml:space="preserve">Duschkopf und Perlator entkalken</w:t>
       </w:r>
@@ -8680,7 +8494,7 @@
         <w:pStyle w:val="ListParagraph"/>
         <w:numPr>
           <w:ilvl w:val="0"/>
-          <w:numId w:val="24"/>
+          <w:numId w:val="22"/>
         </w:numPr>
         <w:spacing w:after="80" w:line="290"/>
       </w:pPr>
@@ -8693,7 +8507,7 @@
         <w:pStyle w:val="ListParagraph"/>
         <w:numPr>
           <w:ilvl w:val="0"/>
-          <w:numId w:val="24"/>
+          <w:numId w:val="22"/>
         </w:numPr>
         <w:spacing w:after="80" w:line="290"/>
       </w:pPr>
@@ -8706,7 +8520,7 @@
         <w:pStyle w:val="ListParagraph"/>
         <w:numPr>
           <w:ilvl w:val="0"/>
-          <w:numId w:val="24"/>
+          <w:numId w:val="22"/>
         </w:numPr>
         <w:spacing w:after="80" w:line="290"/>
       </w:pPr>
@@ -8719,7 +8533,7 @@
         <w:pStyle w:val="ListParagraph"/>
         <w:numPr>
           <w:ilvl w:val="0"/>
-          <w:numId w:val="24"/>
+          <w:numId w:val="22"/>
         </w:numPr>
         <w:spacing w:after="80" w:line="290"/>
       </w:pPr>
@@ -8731,7 +8545,7 @@
       <w:pPr>
         <w:pStyle w:val="Heading3"/>
       </w:pPr>
-      <w:bookmarkStart w:name="r23" w:id="1"/>
+      <w:bookmarkStart w:name="r21" w:id="1"/>
       <w:r>
         <w:t xml:space="preserve">Wasserkocher entkalken</w:t>
       </w:r>
@@ -8805,7 +8619,7 @@
         <w:pStyle w:val="ListParagraph"/>
         <w:numPr>
           <w:ilvl w:val="0"/>
-          <w:numId w:val="25"/>
+          <w:numId w:val="23"/>
         </w:numPr>
         <w:spacing w:after="80" w:line="290"/>
       </w:pPr>
@@ -8828,7 +8642,7 @@
         <w:pStyle w:val="ListParagraph"/>
         <w:numPr>
           <w:ilvl w:val="0"/>
-          <w:numId w:val="25"/>
+          <w:numId w:val="23"/>
         </w:numPr>
         <w:spacing w:after="80" w:line="290"/>
       </w:pPr>
@@ -8841,7 +8655,7 @@
         <w:pStyle w:val="ListParagraph"/>
         <w:numPr>
           <w:ilvl w:val="0"/>
-          <w:numId w:val="25"/>
+          <w:numId w:val="23"/>
         </w:numPr>
         <w:spacing w:after="80" w:line="290"/>
       </w:pPr>
@@ -8900,7 +8714,7 @@
       <w:pPr>
         <w:pStyle w:val="Heading3"/>
       </w:pPr>
-      <w:bookmarkStart w:name="r24" w:id="1"/>
+      <w:bookmarkStart w:name="r22" w:id="1"/>
       <w:r>
         <w:t xml:space="preserve">Badreiniger-Paste</w:t>
       </w:r>
@@ -8987,7 +8801,7 @@
         <w:pStyle w:val="ListParagraph"/>
         <w:numPr>
           <w:ilvl w:val="0"/>
-          <w:numId w:val="26"/>
+          <w:numId w:val="24"/>
         </w:numPr>
         <w:spacing w:after="80" w:line="290"/>
       </w:pPr>
@@ -9000,7 +8814,7 @@
         <w:pStyle w:val="ListParagraph"/>
         <w:numPr>
           <w:ilvl w:val="0"/>
-          <w:numId w:val="26"/>
+          <w:numId w:val="24"/>
         </w:numPr>
         <w:spacing w:after="80" w:line="290"/>
       </w:pPr>
@@ -9013,7 +8827,7 @@
         <w:pStyle w:val="ListParagraph"/>
         <w:numPr>
           <w:ilvl w:val="0"/>
-          <w:numId w:val="26"/>
+          <w:numId w:val="24"/>
         </w:numPr>
         <w:spacing w:after="80" w:line="290"/>
       </w:pPr>
@@ -9049,7 +8863,7 @@
       <w:pPr>
         <w:pStyle w:val="Heading3"/>
       </w:pPr>
-      <w:bookmarkStart w:name="r25" w:id="1"/>
+      <w:bookmarkStart w:name="r23" w:id="1"/>
       <w:r>
         <w:t xml:space="preserve">WC-Reiniger gegen Urinstein</w:t>
       </w:r>
@@ -9136,7 +8950,7 @@
         <w:pStyle w:val="ListParagraph"/>
         <w:numPr>
           <w:ilvl w:val="0"/>
-          <w:numId w:val="27"/>
+          <w:numId w:val="25"/>
         </w:numPr>
         <w:spacing w:after="80" w:line="290"/>
       </w:pPr>
@@ -9149,7 +8963,7 @@
         <w:pStyle w:val="ListParagraph"/>
         <w:numPr>
           <w:ilvl w:val="0"/>
-          <w:numId w:val="27"/>
+          <w:numId w:val="25"/>
         </w:numPr>
         <w:spacing w:after="80" w:line="290"/>
       </w:pPr>
@@ -9162,7 +8976,7 @@
         <w:pStyle w:val="ListParagraph"/>
         <w:numPr>
           <w:ilvl w:val="0"/>
-          <w:numId w:val="27"/>
+          <w:numId w:val="25"/>
         </w:numPr>
         <w:spacing w:after="80" w:line="290"/>
       </w:pPr>
@@ -9187,7 +9001,7 @@
       <w:pPr>
         <w:pStyle w:val="Heading3"/>
       </w:pPr>
-      <w:bookmarkStart w:name="r26" w:id="1"/>
+      <w:bookmarkStart w:name="r24" w:id="1"/>
       <w:r>
         <w:t xml:space="preserve">WC-Tabs zum Vorrätighalten</w:t>
       </w:r>
@@ -9300,7 +9114,7 @@
         <w:pStyle w:val="ListParagraph"/>
         <w:numPr>
           <w:ilvl w:val="0"/>
-          <w:numId w:val="28"/>
+          <w:numId w:val="26"/>
         </w:numPr>
         <w:spacing w:after="80" w:line="290"/>
       </w:pPr>
@@ -9313,7 +9127,7 @@
         <w:pStyle w:val="ListParagraph"/>
         <w:numPr>
           <w:ilvl w:val="0"/>
-          <w:numId w:val="28"/>
+          <w:numId w:val="26"/>
         </w:numPr>
         <w:spacing w:after="80" w:line="290"/>
       </w:pPr>
@@ -9336,7 +9150,7 @@
         <w:pStyle w:val="ListParagraph"/>
         <w:numPr>
           <w:ilvl w:val="0"/>
-          <w:numId w:val="28"/>
+          <w:numId w:val="26"/>
         </w:numPr>
         <w:spacing w:after="80" w:line="290"/>
       </w:pPr>
@@ -9349,7 +9163,7 @@
         <w:pStyle w:val="ListParagraph"/>
         <w:numPr>
           <w:ilvl w:val="0"/>
-          <w:numId w:val="28"/>
+          <w:numId w:val="26"/>
         </w:numPr>
         <w:spacing w:after="80" w:line="290"/>
       </w:pPr>
@@ -9439,7 +9253,7 @@
         <w:pStyle w:val="ListParagraph"/>
         <w:numPr>
           <w:ilvl w:val="0"/>
-          <w:numId w:val="29"/>
+          <w:numId w:val="27"/>
         </w:numPr>
         <w:spacing w:after="80" w:line="290"/>
       </w:pPr>
@@ -9459,7 +9273,7 @@
         <w:pStyle w:val="ListParagraph"/>
         <w:numPr>
           <w:ilvl w:val="0"/>
-          <w:numId w:val="29"/>
+          <w:numId w:val="27"/>
         </w:numPr>
         <w:spacing w:after="80" w:line="290"/>
       </w:pPr>
@@ -9479,7 +9293,7 @@
         <w:pStyle w:val="ListParagraph"/>
         <w:numPr>
           <w:ilvl w:val="0"/>
-          <w:numId w:val="29"/>
+          <w:numId w:val="27"/>
         </w:numPr>
         <w:spacing w:after="80" w:line="290"/>
       </w:pPr>
@@ -9499,7 +9313,7 @@
         <w:pStyle w:val="ListParagraph"/>
         <w:numPr>
           <w:ilvl w:val="0"/>
-          <w:numId w:val="29"/>
+          <w:numId w:val="27"/>
         </w:numPr>
         <w:spacing w:after="80" w:line="290"/>
       </w:pPr>
@@ -9519,7 +9333,7 @@
         <w:pStyle w:val="ListParagraph"/>
         <w:numPr>
           <w:ilvl w:val="0"/>
-          <w:numId w:val="29"/>
+          <w:numId w:val="27"/>
         </w:numPr>
         <w:spacing w:after="80" w:line="290"/>
       </w:pPr>
@@ -9541,7 +9355,7 @@
       <w:pPr>
         <w:pStyle w:val="Heading3"/>
       </w:pPr>
-      <w:bookmarkStart w:name="r27" w:id="1"/>
+      <w:bookmarkStart w:name="r25" w:id="1"/>
       <w:r>
         <w:t xml:space="preserve">Vorbeugende Abfluss-Pflege</w:t>
       </w:r>
@@ -9615,7 +9429,7 @@
         <w:pStyle w:val="ListParagraph"/>
         <w:numPr>
           <w:ilvl w:val="0"/>
-          <w:numId w:val="30"/>
+          <w:numId w:val="28"/>
         </w:numPr>
         <w:spacing w:after="80" w:line="290"/>
       </w:pPr>
@@ -9628,7 +9442,7 @@
         <w:pStyle w:val="ListParagraph"/>
         <w:numPr>
           <w:ilvl w:val="0"/>
-          <w:numId w:val="30"/>
+          <w:numId w:val="28"/>
         </w:numPr>
         <w:spacing w:after="80" w:line="290"/>
       </w:pPr>
@@ -9641,7 +9455,7 @@
         <w:pStyle w:val="ListParagraph"/>
         <w:numPr>
           <w:ilvl w:val="0"/>
-          <w:numId w:val="30"/>
+          <w:numId w:val="28"/>
         </w:numPr>
         <w:spacing w:after="80" w:line="290"/>
       </w:pPr>
@@ -9723,7 +9537,7 @@
       <w:pPr>
         <w:pStyle w:val="Heading3"/>
       </w:pPr>
-      <w:bookmarkStart w:name="r28" w:id="1"/>
+      <w:bookmarkStart w:name="r26" w:id="1"/>
       <w:r>
         <w:t xml:space="preserve">Wischwasser mit Kastanien oder Efeu</w:t>
       </w:r>
@@ -9810,7 +9624,7 @@
         <w:pStyle w:val="ListParagraph"/>
         <w:numPr>
           <w:ilvl w:val="0"/>
-          <w:numId w:val="31"/>
+          <w:numId w:val="29"/>
         </w:numPr>
         <w:spacing w:after="80" w:line="290"/>
       </w:pPr>
@@ -9823,7 +9637,7 @@
         <w:pStyle w:val="ListParagraph"/>
         <w:numPr>
           <w:ilvl w:val="0"/>
-          <w:numId w:val="31"/>
+          <w:numId w:val="29"/>
         </w:numPr>
         <w:spacing w:after="80" w:line="290"/>
       </w:pPr>
@@ -9848,7 +9662,7 @@
       <w:pPr>
         <w:pStyle w:val="Heading3"/>
       </w:pPr>
-      <w:bookmarkStart w:name="r29" w:id="1"/>
+      <w:bookmarkStart w:name="r27" w:id="1"/>
       <w:r>
         <w:t xml:space="preserve">Zitrusreiniger aus Orangenschalen</w:t>
       </w:r>
@@ -9935,7 +9749,7 @@
         <w:pStyle w:val="ListParagraph"/>
         <w:numPr>
           <w:ilvl w:val="0"/>
-          <w:numId w:val="32"/>
+          <w:numId w:val="30"/>
         </w:numPr>
         <w:spacing w:after="80" w:line="290"/>
       </w:pPr>
@@ -9948,7 +9762,7 @@
         <w:pStyle w:val="ListParagraph"/>
         <w:numPr>
           <w:ilvl w:val="0"/>
-          <w:numId w:val="32"/>
+          <w:numId w:val="30"/>
         </w:numPr>
         <w:spacing w:after="80" w:line="290"/>
       </w:pPr>
@@ -9961,7 +9775,7 @@
         <w:pStyle w:val="ListParagraph"/>
         <w:numPr>
           <w:ilvl w:val="0"/>
-          <w:numId w:val="32"/>
+          <w:numId w:val="30"/>
         </w:numPr>
         <w:spacing w:after="80" w:line="290"/>
       </w:pPr>
@@ -10634,7 +10448,7 @@
       <w:pPr>
         <w:pStyle w:val="Heading3"/>
       </w:pPr>
-      <w:bookmarkStart w:name="r30" w:id="1"/>
+      <w:bookmarkStart w:name="r28" w:id="1"/>
       <w:r>
         <w:t xml:space="preserve">Teppich auffrischen mit Natron</w:t>
       </w:r>
@@ -10708,7 +10522,7 @@
         <w:pStyle w:val="ListParagraph"/>
         <w:numPr>
           <w:ilvl w:val="0"/>
-          <w:numId w:val="33"/>
+          <w:numId w:val="31"/>
         </w:numPr>
         <w:spacing w:after="80" w:line="290"/>
       </w:pPr>
@@ -10721,7 +10535,7 @@
         <w:pStyle w:val="ListParagraph"/>
         <w:numPr>
           <w:ilvl w:val="0"/>
-          <w:numId w:val="33"/>
+          <w:numId w:val="31"/>
         </w:numPr>
         <w:spacing w:after="80" w:line="290"/>
       </w:pPr>
@@ -10734,7 +10548,7 @@
         <w:pStyle w:val="ListParagraph"/>
         <w:numPr>
           <w:ilvl w:val="0"/>
-          <w:numId w:val="33"/>
+          <w:numId w:val="31"/>
         </w:numPr>
         <w:spacing w:after="80" w:line="290"/>
       </w:pPr>
@@ -10789,7 +10603,7 @@
       <w:pPr>
         <w:pStyle w:val="Heading3"/>
       </w:pPr>
-      <w:bookmarkStart w:name="r31" w:id="1"/>
+      <w:bookmarkStart w:name="r29" w:id="1"/>
       <w:r>
         <w:t xml:space="preserve">Fensterputzmittel</w:t>
       </w:r>
@@ -10876,7 +10690,7 @@
         <w:pStyle w:val="ListParagraph"/>
         <w:numPr>
           <w:ilvl w:val="0"/>
-          <w:numId w:val="34"/>
+          <w:numId w:val="32"/>
         </w:numPr>
         <w:spacing w:after="80" w:line="290"/>
       </w:pPr>
@@ -10889,7 +10703,7 @@
         <w:pStyle w:val="ListParagraph"/>
         <w:numPr>
           <w:ilvl w:val="0"/>
-          <w:numId w:val="34"/>
+          <w:numId w:val="32"/>
         </w:numPr>
         <w:spacing w:after="80" w:line="290"/>
       </w:pPr>
@@ -10902,7 +10716,7 @@
         <w:pStyle w:val="ListParagraph"/>
         <w:numPr>
           <w:ilvl w:val="0"/>
-          <w:numId w:val="34"/>
+          <w:numId w:val="32"/>
         </w:numPr>
         <w:spacing w:after="80" w:line="290"/>
       </w:pPr>
@@ -10915,7 +10729,7 @@
         <w:pStyle w:val="ListParagraph"/>
         <w:numPr>
           <w:ilvl w:val="0"/>
-          <w:numId w:val="34"/>
+          <w:numId w:val="32"/>
         </w:numPr>
         <w:spacing w:after="80" w:line="290"/>
       </w:pPr>
@@ -10940,7 +10754,7 @@
       <w:pPr>
         <w:pStyle w:val="Heading3"/>
       </w:pPr>
-      <w:bookmarkStart w:name="r32" w:id="1"/>
+      <w:bookmarkStart w:name="r30" w:id="1"/>
       <w:r>
         <w:t xml:space="preserve">Glas- und Spiegelspray</w:t>
       </w:r>
@@ -11027,7 +10841,7 @@
         <w:pStyle w:val="ListParagraph"/>
         <w:numPr>
           <w:ilvl w:val="0"/>
-          <w:numId w:val="35"/>
+          <w:numId w:val="33"/>
         </w:numPr>
         <w:spacing w:after="80" w:line="290"/>
       </w:pPr>
@@ -11040,7 +10854,7 @@
         <w:pStyle w:val="ListParagraph"/>
         <w:numPr>
           <w:ilvl w:val="0"/>
-          <w:numId w:val="35"/>
+          <w:numId w:val="33"/>
         </w:numPr>
         <w:spacing w:after="80" w:line="290"/>
       </w:pPr>
@@ -11139,7 +10953,7 @@
       <w:pPr>
         <w:pStyle w:val="Heading3"/>
       </w:pPr>
-      <w:bookmarkStart w:name="r33" w:id="1"/>
+      <w:bookmarkStart w:name="r31" w:id="1"/>
       <w:r>
         <w:t xml:space="preserve">Möbelpolitur für geöltes Holz</w:t>
       </w:r>
@@ -11226,7 +11040,7 @@
         <w:pStyle w:val="ListParagraph"/>
         <w:numPr>
           <w:ilvl w:val="0"/>
-          <w:numId w:val="36"/>
+          <w:numId w:val="34"/>
         </w:numPr>
         <w:spacing w:after="80" w:line="290"/>
       </w:pPr>
@@ -11239,7 +11053,7 @@
         <w:pStyle w:val="ListParagraph"/>
         <w:numPr>
           <w:ilvl w:val="0"/>
-          <w:numId w:val="36"/>
+          <w:numId w:val="34"/>
         </w:numPr>
         <w:spacing w:after="80" w:line="290"/>
       </w:pPr>
@@ -11252,7 +11066,7 @@
         <w:pStyle w:val="ListParagraph"/>
         <w:numPr>
           <w:ilvl w:val="0"/>
-          <w:numId w:val="36"/>
+          <w:numId w:val="34"/>
         </w:numPr>
         <w:spacing w:after="80" w:line="290"/>
       </w:pPr>
@@ -11339,7 +11153,7 @@
       <w:pPr>
         <w:pStyle w:val="Heading3"/>
       </w:pPr>
-      <w:bookmarkStart w:name="r34" w:id="1"/>
+      <w:bookmarkStart w:name="r32" w:id="1"/>
       <w:r>
         <w:t xml:space="preserve">Lederbalsam</w:t>
       </w:r>
@@ -11380,7 +11194,7 @@
         <w:spacing w:after="80" w:line="290"/>
       </w:pPr>
       <w:r>
-        <w:t xml:space="preserve">20 g Bienenwachs</w:t>
+        <w:t xml:space="preserve">14 g Candelillawachs (pflanzliches Wachs)</w:t>
       </w:r>
     </w:p>
     <w:p>
@@ -11426,7 +11240,7 @@
         <w:pStyle w:val="ListParagraph"/>
         <w:numPr>
           <w:ilvl w:val="0"/>
-          <w:numId w:val="37"/>
+          <w:numId w:val="35"/>
         </w:numPr>
         <w:spacing w:after="80" w:line="290"/>
       </w:pPr>
@@ -11439,7 +11253,7 @@
         <w:pStyle w:val="ListParagraph"/>
         <w:numPr>
           <w:ilvl w:val="0"/>
-          <w:numId w:val="37"/>
+          <w:numId w:val="35"/>
         </w:numPr>
         <w:spacing w:after="80" w:line="290"/>
       </w:pPr>
@@ -11452,7 +11266,7 @@
         <w:pStyle w:val="ListParagraph"/>
         <w:numPr>
           <w:ilvl w:val="0"/>
-          <w:numId w:val="37"/>
+          <w:numId w:val="35"/>
         </w:numPr>
         <w:spacing w:after="80" w:line="290"/>
       </w:pPr>
@@ -11475,24 +11289,157 @@
     </w:p>
     <w:p>
       <w:pPr>
-        <w:spacing w:after="140" w:before="60" w:line="280"/>
+        <w:spacing w:after="140" w:line="300"/>
+        <w:jc w:val="both"/>
+      </w:pPr>
+      <w:r>
+        <w:t xml:space="preserve">Glattleder reinigen: mit einem nebelfeuchten Tuch und ein wenig Seifenkraut- oder Waschnusssud abwischen, trocknen lassen, dann pflegen.</w:t>
+      </w:r>
+    </w:p>
+    <w:p>
+      <w:pPr>
+        <w:pStyle w:val="Heading2"/>
+      </w:pPr>
+      <w:r>
+        <w:t xml:space="preserve">Metall</w:t>
+      </w:r>
+    </w:p>
+    <w:p>
+      <w:pPr>
+        <w:pStyle w:val="Heading3"/>
+      </w:pPr>
+      <w:bookmarkStart w:name="r33" w:id="1"/>
+      <w:r>
+        <w:t xml:space="preserve">Silber putzen mit Alufolie und Natron</w:t>
+      </w:r>
+      <w:bookmarkEnd w:id="1"/>
+    </w:p>
+    <w:p>
+      <w:pPr>
+        <w:spacing w:after="140" w:line="300"/>
+        <w:jc w:val="left"/>
+      </w:pPr>
+      <w:r>
+        <w:rPr>
+          <w:i/>
+          <w:iCs/>
+        </w:rPr>
+        <w:t xml:space="preserve">Für Besteck und Schmuck</w:t>
+      </w:r>
+    </w:p>
+    <w:p>
+      <w:pPr>
+        <w:spacing w:after="60"/>
       </w:pPr>
       <w:r>
         <w:rPr>
           <w:b/>
           <w:bCs/>
-          <w:color w:val="3E5A2A"/>
-          <w:sz w:val="20"/>
-          <w:szCs w:val="20"/>
-        </w:rPr>
-        <w:t xml:space="preserve">Tausch-Tipp: </w:t>
-      </w:r>
-      <w:r>
-        <w:rPr>
-          <w:sz w:val="20"/>
-          <w:szCs w:val="20"/>
-        </w:rPr>
-        <w:t xml:space="preserve">Statt Bienenwachs 15 g Candelilla- oder Carnaubawachs.</w:t>
+        </w:rPr>
+        <w:t xml:space="preserve">Du brauchst</w:t>
+      </w:r>
+    </w:p>
+    <w:p>
+      <w:pPr>
+        <w:pStyle w:val="ListParagraph"/>
+        <w:numPr>
+          <w:ilvl w:val="0"/>
+          <w:numId w:val="2"/>
+        </w:numPr>
+        <w:spacing w:after="80" w:line="290"/>
+      </w:pPr>
+      <w:r>
+        <w:t xml:space="preserve">eine Schüssel (kein Metall), mit Alufolie ausgelegt (glänzende Seite nach oben)</w:t>
+      </w:r>
+    </w:p>
+    <w:p>
+      <w:pPr>
+        <w:pStyle w:val="ListParagraph"/>
+        <w:numPr>
+          <w:ilvl w:val="0"/>
+          <w:numId w:val="2"/>
+        </w:numPr>
+        <w:spacing w:after="80" w:line="290"/>
+      </w:pPr>
+      <w:r>
+        <w:t xml:space="preserve">1 Liter heißes Wasser</w:t>
+      </w:r>
+    </w:p>
+    <w:p>
+      <w:pPr>
+        <w:pStyle w:val="ListParagraph"/>
+        <w:numPr>
+          <w:ilvl w:val="0"/>
+          <w:numId w:val="2"/>
+        </w:numPr>
+        <w:spacing w:after="80" w:line="290"/>
+      </w:pPr>
+      <w:r>
+        <w:t xml:space="preserve">2 EL Natron, 1 EL Salz</w:t>
+      </w:r>
+    </w:p>
+    <w:p>
+      <w:pPr>
+        <w:spacing w:after="60" w:before="120"/>
+      </w:pPr>
+      <w:r>
+        <w:rPr>
+          <w:b/>
+          <w:bCs/>
+        </w:rPr>
+        <w:t xml:space="preserve">So geht es</w:t>
+      </w:r>
+    </w:p>
+    <w:p>
+      <w:pPr>
+        <w:pStyle w:val="ListParagraph"/>
+        <w:numPr>
+          <w:ilvl w:val="0"/>
+          <w:numId w:val="36"/>
+        </w:numPr>
+        <w:spacing w:after="80" w:line="290"/>
+      </w:pPr>
+      <w:r>
+        <w:t xml:space="preserve">Natron und Salz im heißen Wasser auflösen und in die Schüssel gießen.</w:t>
+      </w:r>
+    </w:p>
+    <w:p>
+      <w:pPr>
+        <w:pStyle w:val="ListParagraph"/>
+        <w:numPr>
+          <w:ilvl w:val="0"/>
+          <w:numId w:val="36"/>
+        </w:numPr>
+        <w:spacing w:after="80" w:line="290"/>
+      </w:pPr>
+      <w:r>
+        <w:t xml:space="preserve">Silber hineinlegen, sodass es die Alufolie berührt.</w:t>
+      </w:r>
+    </w:p>
+    <w:p>
+      <w:pPr>
+        <w:pStyle w:val="ListParagraph"/>
+        <w:numPr>
+          <w:ilvl w:val="0"/>
+          <w:numId w:val="36"/>
+        </w:numPr>
+        <w:spacing w:after="80" w:line="290"/>
+      </w:pPr>
+      <w:r>
+        <w:t xml:space="preserve">5 bis 10 Minuten warten – der schwarze Belag wandert auf die Folie (es riecht leicht nach Schwefel).</w:t>
+      </w:r>
+    </w:p>
+    <w:p>
+      <w:pPr>
+        <w:pStyle w:val="ListParagraph"/>
+        <w:numPr>
+          <w:ilvl w:val="0"/>
+          <w:numId w:val="36"/>
+        </w:numPr>
+        <w:spacing w:after="80" w:line="290"/>
+      </w:pPr>
+      <w:r>
+        <w:t xml:space="preserve">Silber abspülen und mit einem weichen Tuch polieren.</w:t>
       </w:r>
     </w:p>
     <w:p>
@@ -11501,24 +11448,20 @@
         <w:jc w:val="both"/>
       </w:pPr>
       <w:r>
-        <w:t xml:space="preserve">Glattleder reinigen: mit einem nebelfeuchten Tuch und ein wenig Seifenkraut- oder Waschnusssud abwischen, trocknen lassen, dann pflegen.</w:t>
-      </w:r>
-    </w:p>
-    <w:p>
-      <w:pPr>
-        <w:pStyle w:val="Heading2"/>
-      </w:pPr>
-      <w:r>
-        <w:t xml:space="preserve">Metall</w:t>
+        <w:rPr>
+          <w:i/>
+          <w:iCs/>
+        </w:rPr>
+        <w:t xml:space="preserve">Tipp: Nicht für Schmuck mit Perlen, Steinen, Klebestellen oder gewollter Patina (Antiksilber).</w:t>
       </w:r>
     </w:p>
     <w:p>
       <w:pPr>
         <w:pStyle w:val="Heading3"/>
       </w:pPr>
-      <w:bookmarkStart w:name="r35" w:id="1"/>
-      <w:r>
-        <w:t xml:space="preserve">Silber putzen mit Alufolie und Natron</w:t>
+      <w:bookmarkStart w:name="r34" w:id="1"/>
+      <w:r>
+        <w:t xml:space="preserve">Messing und Kupfer polieren</w:t>
       </w:r>
       <w:bookmarkEnd w:id="1"/>
     </w:p>
@@ -11532,7 +11475,7 @@
           <w:i/>
           <w:iCs/>
         </w:rPr>
-        <w:t xml:space="preserve">Für Besteck und Schmuck</w:t>
+        <w:t xml:space="preserve">Für Töpfe, Griffe, Dekoration</w:t>
       </w:r>
     </w:p>
     <w:p>
@@ -11557,7 +11500,7 @@
         <w:spacing w:after="80" w:line="290"/>
       </w:pPr>
       <w:r>
-        <w:t xml:space="preserve">eine Schüssel (kein Metall), mit Alufolie ausgelegt (glänzende Seite nach oben)</w:t>
+        <w:t xml:space="preserve">½ Zitrone</w:t>
       </w:r>
     </w:p>
     <w:p>
@@ -11570,7 +11513,7 @@
         <w:spacing w:after="80" w:line="290"/>
       </w:pPr>
       <w:r>
-        <w:t xml:space="preserve">1 Liter heißes Wasser</w:t>
+        <w:t xml:space="preserve">1 EL Salz</w:t>
       </w:r>
     </w:p>
     <w:p>
@@ -11583,7 +11526,7 @@
         <w:spacing w:after="80" w:line="290"/>
       </w:pPr>
       <w:r>
-        <w:t xml:space="preserve">2 EL Natron, 1 EL Salz</w:t>
+        <w:t xml:space="preserve">oder: Paste aus 1 EL Essig, 1 EL Salz, 1 EL Mehl</w:t>
       </w:r>
     </w:p>
     <w:p>
@@ -11603,51 +11546,25 @@
         <w:pStyle w:val="ListParagraph"/>
         <w:numPr>
           <w:ilvl w:val="0"/>
-          <w:numId w:val="38"/>
-        </w:numPr>
-        <w:spacing w:after="80" w:line="290"/>
-      </w:pPr>
-      <w:r>
-        <w:t xml:space="preserve">Natron und Salz im heißen Wasser auflösen und in die Schüssel gießen.</w:t>
-      </w:r>
-    </w:p>
-    <w:p>
-      <w:pPr>
-        <w:pStyle w:val="ListParagraph"/>
-        <w:numPr>
-          <w:ilvl w:val="0"/>
-          <w:numId w:val="38"/>
-        </w:numPr>
-        <w:spacing w:after="80" w:line="290"/>
-      </w:pPr>
-      <w:r>
-        <w:t xml:space="preserve">Silber hineinlegen, sodass es die Alufolie berührt.</w:t>
-      </w:r>
-    </w:p>
-    <w:p>
-      <w:pPr>
-        <w:pStyle w:val="ListParagraph"/>
-        <w:numPr>
-          <w:ilvl w:val="0"/>
-          <w:numId w:val="38"/>
-        </w:numPr>
-        <w:spacing w:after="80" w:line="290"/>
-      </w:pPr>
-      <w:r>
-        <w:t xml:space="preserve">5 bis 10 Minuten warten – der schwarze Belag wandert auf die Folie (es riecht leicht nach Schwefel).</w:t>
-      </w:r>
-    </w:p>
-    <w:p>
-      <w:pPr>
-        <w:pStyle w:val="ListParagraph"/>
-        <w:numPr>
-          <w:ilvl w:val="0"/>
-          <w:numId w:val="38"/>
-        </w:numPr>
-        <w:spacing w:after="80" w:line="290"/>
-      </w:pPr>
-      <w:r>
-        <w:t xml:space="preserve">Silber abspülen und mit einem weichen Tuch polieren.</w:t>
+          <w:numId w:val="37"/>
+        </w:numPr>
+        <w:spacing w:after="80" w:line="290"/>
+      </w:pPr>
+      <w:r>
+        <w:t xml:space="preserve">Salz auf die Schnittfläche der Zitrone streuen und das Metall damit abreiben – oder die Paste auftragen und 15 Minuten einwirken lassen.</w:t>
+      </w:r>
+    </w:p>
+    <w:p>
+      <w:pPr>
+        <w:pStyle w:val="ListParagraph"/>
+        <w:numPr>
+          <w:ilvl w:val="0"/>
+          <w:numId w:val="37"/>
+        </w:numPr>
+        <w:spacing w:after="80" w:line="290"/>
+      </w:pPr>
+      <w:r>
+        <w:t xml:space="preserve">Gründlich abspülen und sofort trocken polieren.</w:t>
       </w:r>
     </w:p>
     <w:p>
@@ -11660,16 +11577,155 @@
           <w:i/>
           <w:iCs/>
         </w:rPr>
-        <w:t xml:space="preserve">Tipp: Nicht für Schmuck mit Perlen, Steinen, Klebestellen oder gewollter Patina (Antiksilber).</w:t>
+        <w:t xml:space="preserve">Tipp: Nicht für lackiertes Messing.</w:t>
+      </w:r>
+    </w:p>
+    <w:p>
+      <w:pPr>
+        <w:pStyle w:val="ListParagraph"/>
+        <w:numPr>
+          <w:ilvl w:val="0"/>
+          <w:numId w:val="2"/>
+        </w:numPr>
+        <w:spacing w:after="80" w:line="290"/>
+      </w:pPr>
+      <w:r>
+        <w:rPr>
+          <w:b/>
+          <w:bCs/>
+        </w:rPr>
+        <w:t xml:space="preserve">Edelstahl:</w:t>
+      </w:r>
+      <w:r>
+        <w:t xml:space="preserve"> mit etwas Öl auf einem Tuch in Schliffrichtung polieren.</w:t>
+      </w:r>
+    </w:p>
+    <w:p>
+      <w:pPr>
+        <w:pStyle w:val="ListParagraph"/>
+        <w:numPr>
+          <w:ilvl w:val="0"/>
+          <w:numId w:val="2"/>
+        </w:numPr>
+        <w:spacing w:after="80" w:line="290"/>
+      </w:pPr>
+      <w:r>
+        <w:rPr>
+          <w:b/>
+          <w:bCs/>
+        </w:rPr>
+        <w:t xml:space="preserve">Chrom:</w:t>
+      </w:r>
+      <w:r>
+        <w:t xml:space="preserve"> mit Essigwasser oder einer zerknüllten, feuchten Alufolie leichten Rost abreiben.</w:t>
+      </w:r>
+    </w:p>
+    <w:p>
+      <w:pPr>
+        <w:pStyle w:val="ListParagraph"/>
+        <w:numPr>
+          <w:ilvl w:val="0"/>
+          <w:numId w:val="2"/>
+        </w:numPr>
+        <w:spacing w:after="80" w:line="290"/>
+      </w:pPr>
+      <w:r>
+        <w:rPr>
+          <w:b/>
+          <w:bCs/>
+        </w:rPr>
+        <w:t xml:space="preserve">Gusseisen:</w:t>
+      </w:r>
+      <w:r>
+        <w:t xml:space="preserve"> siehe Kapitel Spülen.</w:t>
+      </w:r>
+    </w:p>
+    <w:p>
+      <w:pPr>
+        <w:pStyle w:val="Heading1"/>
+        <w:pageBreakBefore/>
+      </w:pPr>
+      <w:bookmarkStart w:name="k_luft_schimmel" w:id="1"/>
+      <w:r>
+        <w:t xml:space="preserve">Gerüche, frische Luft und Schimmel</w:t>
+      </w:r>
+      <w:bookmarkEnd w:id="1"/>
+    </w:p>
+    <w:p>
+      <w:pPr>
+        <w:pStyle w:val="Heading2"/>
+      </w:pPr>
+      <w:r>
+        <w:t xml:space="preserve">Gerüche binden statt überdecken</w:t>
+      </w:r>
+    </w:p>
+    <w:p>
+      <w:pPr>
+        <w:pStyle w:val="ListParagraph"/>
+        <w:numPr>
+          <w:ilvl w:val="0"/>
+          <w:numId w:val="2"/>
+        </w:numPr>
+        <w:spacing w:after="80" w:line="290"/>
+      </w:pPr>
+      <w:r>
+        <w:rPr>
+          <w:b/>
+          <w:bCs/>
+        </w:rPr>
+        <w:t xml:space="preserve">Natron</w:t>
+      </w:r>
+      <w:r>
+        <w:t xml:space="preserve"> in offenen Schälchen bindet Gerüche im Kühlschrank, Schuhschrank und Mülleimer.</w:t>
+      </w:r>
+    </w:p>
+    <w:p>
+      <w:pPr>
+        <w:pStyle w:val="ListParagraph"/>
+        <w:numPr>
+          <w:ilvl w:val="0"/>
+          <w:numId w:val="2"/>
+        </w:numPr>
+        <w:spacing w:after="80" w:line="290"/>
+      </w:pPr>
+      <w:r>
+        <w:rPr>
+          <w:b/>
+          <w:bCs/>
+        </w:rPr>
+        <w:t xml:space="preserve">Kaffeesatz</w:t>
+      </w:r>
+      <w:r>
+        <w:t xml:space="preserve"> (getrocknet) bindet Gerüche im Kühlschrank und an den Händen nach Zwiebelschneiden.</w:t>
+      </w:r>
+    </w:p>
+    <w:p>
+      <w:pPr>
+        <w:pStyle w:val="ListParagraph"/>
+        <w:numPr>
+          <w:ilvl w:val="0"/>
+          <w:numId w:val="2"/>
+        </w:numPr>
+        <w:spacing w:after="80" w:line="290"/>
+      </w:pPr>
+      <w:r>
+        <w:rPr>
+          <w:b/>
+          <w:bCs/>
+        </w:rPr>
+        <w:t xml:space="preserve">Stoßlüften</w:t>
+      </w:r>
+      <w:r>
+        <w:t xml:space="preserve"> statt Kipplüften: 3- bis 4-mal täglich 5 bis 10 Minuten die Fenster weit öffnen.</w:t>
       </w:r>
     </w:p>
     <w:p>
       <w:pPr>
         <w:pStyle w:val="Heading3"/>
       </w:pPr>
-      <w:bookmarkStart w:name="r36" w:id="1"/>
-      <w:r>
-        <w:t xml:space="preserve">Messing und Kupfer polieren</w:t>
+      <w:bookmarkStart w:name="r35" w:id="1"/>
+      <w:r>
+        <w:t xml:space="preserve">Schuh-Deo-Säckchen</w:t>
       </w:r>
       <w:bookmarkEnd w:id="1"/>
     </w:p>
@@ -11683,7 +11739,7 @@
           <w:i/>
           <w:iCs/>
         </w:rPr>
-        <w:t xml:space="preserve">Für Töpfe, Griffe, Dekoration</w:t>
+        <w:t xml:space="preserve">Für ein Paar Schuhe</w:t>
       </w:r>
     </w:p>
     <w:p>
@@ -11708,7 +11764,7 @@
         <w:spacing w:after="80" w:line="290"/>
       </w:pPr>
       <w:r>
-        <w:t xml:space="preserve">½ Zitrone</w:t>
+        <w:t xml:space="preserve">2 alte Socken oder kleine Stoffbeutel</w:t>
       </w:r>
     </w:p>
     <w:p>
@@ -11721,7 +11777,7 @@
         <w:spacing w:after="80" w:line="290"/>
       </w:pPr>
       <w:r>
-        <w:t xml:space="preserve">1 EL Salz</w:t>
+        <w:t xml:space="preserve">4 EL Natron</w:t>
       </w:r>
     </w:p>
     <w:p>
@@ -11734,7 +11790,7 @@
         <w:spacing w:after="80" w:line="290"/>
       </w:pPr>
       <w:r>
-        <w:t xml:space="preserve">oder: Paste aus 1 EL Essig, 1 EL Salz, 1 EL Mehl</w:t>
+        <w:t xml:space="preserve">nach Belieben getrocknete Lavendelblüten</w:t>
       </w:r>
     </w:p>
     <w:p>
@@ -11754,12 +11810,124 @@
         <w:pStyle w:val="ListParagraph"/>
         <w:numPr>
           <w:ilvl w:val="0"/>
+          <w:numId w:val="38"/>
+        </w:numPr>
+        <w:spacing w:after="80" w:line="290"/>
+      </w:pPr>
+      <w:r>
+        <w:t xml:space="preserve">Natron (und Lavendel) in die Socken füllen und zuknoten.</w:t>
+      </w:r>
+    </w:p>
+    <w:p>
+      <w:pPr>
+        <w:pStyle w:val="ListParagraph"/>
+        <w:numPr>
+          <w:ilvl w:val="0"/>
+          <w:numId w:val="38"/>
+        </w:numPr>
+        <w:spacing w:after="80" w:line="290"/>
+      </w:pPr>
+      <w:r>
+        <w:t xml:space="preserve">Über Nacht in die Schuhe legen.</w:t>
+      </w:r>
+    </w:p>
+    <w:p>
+      <w:pPr>
+        <w:pStyle w:val="ListParagraph"/>
+        <w:numPr>
+          <w:ilvl w:val="0"/>
+          <w:numId w:val="38"/>
+        </w:numPr>
+        <w:spacing w:after="80" w:line="290"/>
+      </w:pPr>
+      <w:r>
+        <w:t xml:space="preserve">Alle paar Wochen das Natron erneuern.</w:t>
+      </w:r>
+    </w:p>
+    <w:p>
+      <w:pPr>
+        <w:pStyle w:val="Heading3"/>
+      </w:pPr>
+      <w:bookmarkStart w:name="r36" w:id="1"/>
+      <w:r>
+        <w:t xml:space="preserve">Raumduft-Topf (Simmer Pot)</w:t>
+      </w:r>
+      <w:bookmarkEnd w:id="1"/>
+    </w:p>
+    <w:p>
+      <w:pPr>
+        <w:spacing w:after="140" w:line="300"/>
+        <w:jc w:val="left"/>
+      </w:pPr>
+      <w:r>
+        <w:rPr>
+          <w:i/>
+          <w:iCs/>
+        </w:rPr>
+        <w:t xml:space="preserve">Für einen gemütlichen Nachmittag</w:t>
+      </w:r>
+    </w:p>
+    <w:p>
+      <w:pPr>
+        <w:spacing w:after="60"/>
+      </w:pPr>
+      <w:r>
+        <w:rPr>
+          <w:b/>
+          <w:bCs/>
+        </w:rPr>
+        <w:t xml:space="preserve">Du brauchst</w:t>
+      </w:r>
+    </w:p>
+    <w:p>
+      <w:pPr>
+        <w:pStyle w:val="ListParagraph"/>
+        <w:numPr>
+          <w:ilvl w:val="0"/>
+          <w:numId w:val="2"/>
+        </w:numPr>
+        <w:spacing w:after="80" w:line="290"/>
+      </w:pPr>
+      <w:r>
+        <w:t xml:space="preserve">ein Topf mit Wasser</w:t>
+      </w:r>
+    </w:p>
+    <w:p>
+      <w:pPr>
+        <w:pStyle w:val="ListParagraph"/>
+        <w:numPr>
+          <w:ilvl w:val="0"/>
+          <w:numId w:val="2"/>
+        </w:numPr>
+        <w:spacing w:after="80" w:line="290"/>
+      </w:pPr>
+      <w:r>
+        <w:t xml:space="preserve">Orangen- oder Apfelschalen, 1 Zimtstange, ein paar Nelken, ein Zweig Fichte oder Rosmarin</w:t>
+      </w:r>
+    </w:p>
+    <w:p>
+      <w:pPr>
+        <w:spacing w:after="60" w:before="120"/>
+      </w:pPr>
+      <w:r>
+        <w:rPr>
+          <w:b/>
+          <w:bCs/>
+        </w:rPr>
+        <w:t xml:space="preserve">So geht es</w:t>
+      </w:r>
+    </w:p>
+    <w:p>
+      <w:pPr>
+        <w:pStyle w:val="ListParagraph"/>
+        <w:numPr>
+          <w:ilvl w:val="0"/>
           <w:numId w:val="39"/>
         </w:numPr>
         <w:spacing w:after="80" w:line="290"/>
       </w:pPr>
       <w:r>
-        <w:t xml:space="preserve">Salz auf die Schnittfläche der Zitrone streuen und das Metall damit abreiben – oder die Paste auftragen und 15 Minuten einwirken lassen.</w:t>
+        <w:t xml:space="preserve">Alles in den Topf geben.</w:t>
       </w:r>
     </w:p>
     <w:p>
@@ -11772,7 +11940,7 @@
         <w:spacing w:after="80" w:line="290"/>
       </w:pPr>
       <w:r>
-        <w:t xml:space="preserve">Gründlich abspülen und sofort trocken polieren.</w:t>
+        <w:t xml:space="preserve">Auf kleinster Stufe leise köcheln lassen und Wasser nachfüllen.</w:t>
       </w:r>
     </w:p>
     <w:p>
@@ -11785,7 +11953,24 @@
           <w:i/>
           <w:iCs/>
         </w:rPr>
-        <w:t xml:space="preserve">Tipp: Nicht für lackiertes Messing.</w:t>
+        <w:t xml:space="preserve">Tipp: Nie unbeaufsichtigt lassen. Statt Duftkerzen und Raumsprays – ohne künstliche Duftstoffe.</w:t>
+      </w:r>
+    </w:p>
+    <w:p>
+      <w:pPr>
+        <w:pStyle w:val="Heading2"/>
+      </w:pPr>
+      <w:r>
+        <w:t xml:space="preserve">Schimmel: was du selbst machen kannst – und was nicht</w:t>
+      </w:r>
+    </w:p>
+    <w:p>
+      <w:pPr>
+        <w:spacing w:after="140" w:line="300"/>
+        <w:jc w:val="both"/>
+      </w:pPr>
+      <w:r>
+        <w:t xml:space="preserve">Schimmel ist kein Schönheitsproblem, sondern kann der Gesundheit schaden. Das Umweltbundesamt empfiehlt:</w:t>
       </w:r>
     </w:p>
     <w:p>
@@ -11802,30 +11987,20 @@
           <w:b/>
           <w:bCs/>
         </w:rPr>
-        <w:t xml:space="preserve">Edelstahl:</w:t>
-      </w:r>
-      <w:r>
-        <w:t xml:space="preserve"> mit etwas Öl auf einem Tuch in Schliffrichtung polieren.</w:t>
-      </w:r>
-    </w:p>
-    <w:p>
-      <w:pPr>
-        <w:pStyle w:val="ListParagraph"/>
-        <w:numPr>
-          <w:ilvl w:val="0"/>
-          <w:numId w:val="2"/>
-        </w:numPr>
-        <w:spacing w:after="80" w:line="290"/>
-      </w:pPr>
+        <w:t xml:space="preserve">Kleine Flächen</w:t>
+      </w:r>
+      <w:r>
+        <w:t xml:space="preserve"> (bis etwa 0,5 m²) auf </w:t>
+      </w:r>
       <w:r>
         <w:rPr>
           <w:b/>
           <w:bCs/>
         </w:rPr>
-        <w:t xml:space="preserve">Chrom:</w:t>
-      </w:r>
-      <w:r>
-        <w:t xml:space="preserve"> mit Essigwasser oder einer zerknüllten, feuchten Alufolie leichten Rost abreiben.</w:t>
+        <w:t xml:space="preserve">glatten, nicht saugfähigen</w:t>
+      </w:r>
+      <w:r>
+        <w:t xml:space="preserve"> Oberflächen (Fliesen, Fensterrahmen, Silikon) kannst du selbst entfernen.</w:t>
       </w:r>
     </w:p>
     <w:p>
@@ -11842,10 +12017,262 @@
           <w:b/>
           <w:bCs/>
         </w:rPr>
-        <w:t xml:space="preserve">Gusseisen:</w:t>
-      </w:r>
-      <w:r>
-        <w:t xml:space="preserve"> siehe Kapitel Spülen.</w:t>
+        <w:t xml:space="preserve">Größere Flächen</w:t>
+      </w:r>
+      <w:r>
+        <w:t xml:space="preserve">, Schimmel in Wänden, unter Tapeten oder nach Wasserschäden gehören in die Hand von </w:t>
+      </w:r>
+      <w:r>
+        <w:rPr>
+          <w:b/>
+          <w:bCs/>
+        </w:rPr>
+        <w:t xml:space="preserve">Fachleuten</w:t>
+      </w:r>
+      <w:r>
+        <w:t xml:space="preserve">. Das gilt auch, wenn Allergiker, Schwangere, kleine Kinder oder Menschen mit geschwächtem Immunsystem im Haushalt leben.</w:t>
+      </w:r>
+    </w:p>
+    <w:p>
+      <w:pPr>
+        <w:pStyle w:val="ListParagraph"/>
+        <w:numPr>
+          <w:ilvl w:val="0"/>
+          <w:numId w:val="2"/>
+        </w:numPr>
+        <w:spacing w:after="80" w:line="290"/>
+      </w:pPr>
+      <w:r>
+        <w:rPr>
+          <w:b/>
+          <w:bCs/>
+        </w:rPr>
+        <w:t xml:space="preserve">Ursache finden:</w:t>
+      </w:r>
+      <w:r>
+        <w:t xml:space="preserve"> zu hohe Luftfeuchtigkeit, Wärmebrücken, undichte Stellen. Ohne die Ursache kommt der Schimmel wieder.</w:t>
+      </w:r>
+    </w:p>
+    <w:p>
+      <w:pPr>
+        <w:pStyle w:val="Heading3"/>
+      </w:pPr>
+      <w:bookmarkStart w:name="r37" w:id="1"/>
+      <w:r>
+        <w:t xml:space="preserve">Kleine Schimmelflecken entfernen</w:t>
+      </w:r>
+      <w:bookmarkEnd w:id="1"/>
+    </w:p>
+    <w:p>
+      <w:pPr>
+        <w:spacing w:after="140" w:line="300"/>
+        <w:jc w:val="left"/>
+      </w:pPr>
+      <w:r>
+        <w:rPr>
+          <w:i/>
+          <w:iCs/>
+        </w:rPr>
+        <w:t xml:space="preserve">Für glatte Oberflächen bis 0,5 m²</w:t>
+      </w:r>
+    </w:p>
+    <w:p>
+      <w:pPr>
+        <w:spacing w:after="60"/>
+      </w:pPr>
+      <w:r>
+        <w:rPr>
+          <w:b/>
+          <w:bCs/>
+        </w:rPr>
+        <w:t xml:space="preserve">Du brauchst</w:t>
+      </w:r>
+    </w:p>
+    <w:p>
+      <w:pPr>
+        <w:pStyle w:val="ListParagraph"/>
+        <w:numPr>
+          <w:ilvl w:val="0"/>
+          <w:numId w:val="2"/>
+        </w:numPr>
+        <w:spacing w:after="80" w:line="290"/>
+      </w:pPr>
+      <w:r>
+        <w:t xml:space="preserve">70- bis 80-prozentiger Ethanol (Weingeist aus der Apotheke)</w:t>
+      </w:r>
+    </w:p>
+    <w:p>
+      <w:pPr>
+        <w:pStyle w:val="ListParagraph"/>
+        <w:numPr>
+          <w:ilvl w:val="0"/>
+          <w:numId w:val="2"/>
+        </w:numPr>
+        <w:spacing w:after="80" w:line="290"/>
+      </w:pPr>
+      <w:r>
+        <w:t xml:space="preserve">Einweg-Tücher, Handschuhe, FFP2-Maske, Schutzbrille</w:t>
+      </w:r>
+    </w:p>
+    <w:p>
+      <w:pPr>
+        <w:spacing w:after="60" w:before="120"/>
+      </w:pPr>
+      <w:r>
+        <w:rPr>
+          <w:b/>
+          <w:bCs/>
+        </w:rPr>
+        <w:t xml:space="preserve">So geht es</w:t>
+      </w:r>
+    </w:p>
+    <w:p>
+      <w:pPr>
+        <w:pStyle w:val="ListParagraph"/>
+        <w:numPr>
+          <w:ilvl w:val="0"/>
+          <w:numId w:val="40"/>
+        </w:numPr>
+        <w:spacing w:after="80" w:line="290"/>
+      </w:pPr>
+      <w:r>
+        <w:t xml:space="preserve">Fenster öffnen, Schutzausrüstung anziehen.</w:t>
+      </w:r>
+    </w:p>
+    <w:p>
+      <w:pPr>
+        <w:pStyle w:val="ListParagraph"/>
+        <w:numPr>
+          <w:ilvl w:val="0"/>
+          <w:numId w:val="40"/>
+        </w:numPr>
+        <w:spacing w:after="80" w:line="290"/>
+      </w:pPr>
+      <w:r>
+        <w:t xml:space="preserve">Schimmel </w:t>
+      </w:r>
+      <w:r>
+        <w:rPr>
+          <w:b/>
+          <w:bCs/>
+        </w:rPr>
+        <w:t xml:space="preserve">nicht trocken abbürsten</w:t>
+      </w:r>
+      <w:r>
+        <w:t xml:space="preserve"> – das verteilt die Sporen.</w:t>
+      </w:r>
+    </w:p>
+    <w:p>
+      <w:pPr>
+        <w:pStyle w:val="ListParagraph"/>
+        <w:numPr>
+          <w:ilvl w:val="0"/>
+          <w:numId w:val="40"/>
+        </w:numPr>
+        <w:spacing w:after="80" w:line="290"/>
+      </w:pPr>
+      <w:r>
+        <w:t xml:space="preserve">Alkohol auf ein Tuch geben und die Fläche abwischen, kurz einwirken lassen, mit einem neuen Tuch nachwischen.</w:t>
+      </w:r>
+    </w:p>
+    <w:p>
+      <w:pPr>
+        <w:pStyle w:val="ListParagraph"/>
+        <w:numPr>
+          <w:ilvl w:val="0"/>
+          <w:numId w:val="40"/>
+        </w:numPr>
+        <w:spacing w:after="80" w:line="290"/>
+      </w:pPr>
+      <w:r>
+        <w:t xml:space="preserve">Tücher in einem verschlossenen Beutel im Restmüll entsorgen.</w:t>
+      </w:r>
+    </w:p>
+    <w:p>
+      <w:pPr>
+        <w:spacing w:after="140" w:line="300"/>
+        <w:jc w:val="both"/>
+      </w:pPr>
+      <w:r>
+        <w:rPr>
+          <w:i/>
+          <w:iCs/>
+        </w:rPr>
+        <w:t xml:space="preserve">Tipp: Ethanol ist – wie im Wein – aus vergorenem Pflanzenzucker gewonnen; hier ist er die eine Ausnahme im Buch, weil das Umweltbundesamt ihn für kleine Schimmelflächen empfiehlt. Er ist entzündlich – keine offenen Flammen, nicht rauchen. </w:t>
+      </w:r>
+      <w:r>
+        <w:rPr>
+          <w:i/>
+          <w:iCs/>
+        </w:rPr>
+        <w:t xml:space="preserve">Essig</w:t>
+      </w:r>
+      <w:r>
+        <w:rPr>
+          <w:i/>
+          <w:iCs/>
+        </w:rPr>
+        <w:t xml:space="preserve"> ist auf kalkhaltigen Wänden ungeeignet: Er wird neutralisiert und kann den Schimmel sogar ernähren.</w:t>
+      </w:r>
+    </w:p>
+    <w:p>
+      <w:pPr>
+        <w:pStyle w:val="Heading2"/>
+      </w:pPr>
+      <w:r>
+        <w:t xml:space="preserve">Richtig lüften und heizen</w:t>
+      </w:r>
+    </w:p>
+    <w:p>
+      <w:pPr>
+        <w:pStyle w:val="ListParagraph"/>
+        <w:numPr>
+          <w:ilvl w:val="0"/>
+          <w:numId w:val="2"/>
+        </w:numPr>
+        <w:spacing w:after="80" w:line="290"/>
+      </w:pPr>
+      <w:r>
+        <w:t xml:space="preserve">Luftfeuchtigkeit mit einem Hygrometer (unter 10 Euro) kontrollieren: Ideal sind 40 bis 60 %.</w:t>
+      </w:r>
+    </w:p>
+    <w:p>
+      <w:pPr>
+        <w:pStyle w:val="ListParagraph"/>
+        <w:numPr>
+          <w:ilvl w:val="0"/>
+          <w:numId w:val="2"/>
+        </w:numPr>
+        <w:spacing w:after="80" w:line="290"/>
+      </w:pPr>
+      <w:r>
+        <w:t xml:space="preserve">Nach dem Duschen, Kochen und Wäschetrocknen sofort stoßlüften.</w:t>
+      </w:r>
+    </w:p>
+    <w:p>
+      <w:pPr>
+        <w:pStyle w:val="ListParagraph"/>
+        <w:numPr>
+          <w:ilvl w:val="0"/>
+          <w:numId w:val="2"/>
+        </w:numPr>
+        <w:spacing w:after="80" w:line="290"/>
+      </w:pPr>
+      <w:r>
+        <w:t xml:space="preserve">Möbel mit etwas Abstand (5 bis 10 cm) zu Außenwänden aufstellen.</w:t>
+      </w:r>
+    </w:p>
+    <w:p>
+      <w:pPr>
+        <w:pStyle w:val="ListParagraph"/>
+        <w:numPr>
+          <w:ilvl w:val="0"/>
+          <w:numId w:val="2"/>
+        </w:numPr>
+        <w:spacing w:after="80" w:line="290"/>
+      </w:pPr>
+      <w:r>
+        <w:t xml:space="preserve">Räume nicht unter 16 °C auskühlen lassen.</w:t>
       </w:r>
     </w:p>
     <w:p>
@@ -11853,58 +12280,64 @@
         <w:pStyle w:val="Heading1"/>
         <w:pageBreakBefore/>
       </w:pPr>
-      <w:bookmarkStart w:name="k_luft_schimmel" w:id="1"/>
-      <w:r>
-        <w:t xml:space="preserve">Gerüche, frische Luft und Schimmel</w:t>
+      <w:bookmarkStart w:name="k_ungeziefer" w:id="1"/>
+      <w:r>
+        <w:t xml:space="preserve">Ungeziefer im Haus</w:t>
       </w:r>
       <w:bookmarkEnd w:id="1"/>
     </w:p>
     <w:p>
       <w:pPr>
-        <w:pStyle w:val="Heading2"/>
-      </w:pPr>
-      <w:r>
-        <w:t xml:space="preserve">Gerüche binden statt überdecken</w:t>
-      </w:r>
-    </w:p>
-    <w:p>
-      <w:pPr>
-        <w:pStyle w:val="ListParagraph"/>
-        <w:numPr>
-          <w:ilvl w:val="0"/>
-          <w:numId w:val="2"/>
-        </w:numPr>
-        <w:spacing w:after="80" w:line="290"/>
-      </w:pPr>
+        <w:spacing w:after="140" w:line="300"/>
+        <w:jc w:val="both"/>
+      </w:pPr>
+      <w:r>
+        <w:t xml:space="preserve">Gegen ungebetene Gäste hilft vor allem eines: </w:t>
+      </w:r>
       <w:r>
         <w:rPr>
           <w:b/>
           <w:bCs/>
         </w:rPr>
-        <w:t xml:space="preserve">Natron</w:t>
-      </w:r>
-      <w:r>
-        <w:t xml:space="preserve"> in offenen Schälchen bindet Gerüche im Kühlschrank, Schuhschrank und Mülleimer.</w:t>
-      </w:r>
-    </w:p>
-    <w:p>
-      <w:pPr>
-        <w:pStyle w:val="ListParagraph"/>
-        <w:numPr>
-          <w:ilvl w:val="0"/>
-          <w:numId w:val="2"/>
-        </w:numPr>
-        <w:spacing w:after="80" w:line="290"/>
+        <w:t xml:space="preserve">Vorbeugung.</w:t>
+      </w:r>
+      <w:r>
+        <w:t xml:space="preserve"> Lebensmittel dicht verschließen, Krümel wegwischen, Ritzen abdichten. Für den Rest gibt es sanfte Hausmittel.</w:t>
+      </w:r>
+    </w:p>
+    <w:p>
+      <w:pPr>
+        <w:pStyle w:val="Heading3"/>
+      </w:pPr>
+      <w:bookmarkStart w:name="r38" w:id="1"/>
+      <w:r>
+        <w:t xml:space="preserve">Fruchtfliegenfalle</w:t>
+      </w:r>
+      <w:bookmarkEnd w:id="1"/>
+    </w:p>
+    <w:p>
+      <w:pPr>
+        <w:spacing w:after="140" w:line="300"/>
+        <w:jc w:val="left"/>
+      </w:pPr>
+      <w:r>
+        <w:rPr>
+          <w:i/>
+          <w:iCs/>
+        </w:rPr>
+        <w:t xml:space="preserve">Für die Küche im Spätsommer</w:t>
+      </w:r>
+    </w:p>
+    <w:p>
+      <w:pPr>
+        <w:spacing w:after="60"/>
       </w:pPr>
       <w:r>
         <w:rPr>
           <w:b/>
           <w:bCs/>
         </w:rPr>
-        <w:t xml:space="preserve">Kaffeesatz</w:t>
-      </w:r>
-      <w:r>
-        <w:t xml:space="preserve"> (getrocknet) bindet Gerüche im Kühlschrank und an den Händen nach Zwiebelschneiden.</w:t>
+        <w:t xml:space="preserve">Du brauchst</w:t>
       </w:r>
     </w:p>
     <w:p>
@@ -11915,25 +12348,259 @@
           <w:numId w:val="2"/>
         </w:numPr>
         <w:spacing w:after="80" w:line="290"/>
+      </w:pPr>
+      <w:r>
+        <w:t xml:space="preserve">ein kleines Glas</w:t>
+      </w:r>
+    </w:p>
+    <w:p>
+      <w:pPr>
+        <w:pStyle w:val="ListParagraph"/>
+        <w:numPr>
+          <w:ilvl w:val="0"/>
+          <w:numId w:val="2"/>
+        </w:numPr>
+        <w:spacing w:after="80" w:line="290"/>
+      </w:pPr>
+      <w:r>
+        <w:t xml:space="preserve">3 EL Apfelessig</w:t>
+      </w:r>
+    </w:p>
+    <w:p>
+      <w:pPr>
+        <w:pStyle w:val="ListParagraph"/>
+        <w:numPr>
+          <w:ilvl w:val="0"/>
+          <w:numId w:val="2"/>
+        </w:numPr>
+        <w:spacing w:after="80" w:line="290"/>
+      </w:pPr>
+      <w:r>
+        <w:t xml:space="preserve">2 EL Saft oder etwas Obst</w:t>
+      </w:r>
+    </w:p>
+    <w:p>
+      <w:pPr>
+        <w:pStyle w:val="ListParagraph"/>
+        <w:numPr>
+          <w:ilvl w:val="0"/>
+          <w:numId w:val="2"/>
+        </w:numPr>
+        <w:spacing w:after="80" w:line="290"/>
+      </w:pPr>
+      <w:r>
+        <w:t xml:space="preserve">1 TL Kastanien-, Efeu- oder Waschnusssud</w:t>
+      </w:r>
+    </w:p>
+    <w:p>
+      <w:pPr>
+        <w:spacing w:after="60" w:before="120"/>
       </w:pPr>
       <w:r>
         <w:rPr>
           <w:b/>
           <w:bCs/>
         </w:rPr>
-        <w:t xml:space="preserve">Stoßlüften</w:t>
-      </w:r>
-      <w:r>
-        <w:t xml:space="preserve"> statt Kipplüften: 3- bis 4-mal täglich 5 bis 10 Minuten die Fenster weit öffnen.</w:t>
+        <w:t xml:space="preserve">So geht es</w:t>
+      </w:r>
+    </w:p>
+    <w:p>
+      <w:pPr>
+        <w:pStyle w:val="ListParagraph"/>
+        <w:numPr>
+          <w:ilvl w:val="0"/>
+          <w:numId w:val="41"/>
+        </w:numPr>
+        <w:spacing w:after="80" w:line="290"/>
+      </w:pPr>
+      <w:r>
+        <w:t xml:space="preserve">Essig und Saft ins Glas geben, den Sud dazugeben – er bricht die Oberflächenspannung, sodass die Fliegen nicht wieder hochkommen.</w:t>
+      </w:r>
+    </w:p>
+    <w:p>
+      <w:pPr>
+        <w:pStyle w:val="ListParagraph"/>
+        <w:numPr>
+          <w:ilvl w:val="0"/>
+          <w:numId w:val="41"/>
+        </w:numPr>
+        <w:spacing w:after="80" w:line="290"/>
+      </w:pPr>
+      <w:r>
+        <w:t xml:space="preserve">Glas neben die Obstschale stellen.</w:t>
+      </w:r>
+    </w:p>
+    <w:p>
+      <w:pPr>
+        <w:pStyle w:val="ListParagraph"/>
+        <w:numPr>
+          <w:ilvl w:val="0"/>
+          <w:numId w:val="41"/>
+        </w:numPr>
+        <w:spacing w:after="80" w:line="290"/>
+      </w:pPr>
+      <w:r>
+        <w:t xml:space="preserve">Alle paar Tage erneuern.</w:t>
+      </w:r>
+    </w:p>
+    <w:p>
+      <w:pPr>
+        <w:spacing w:after="140" w:line="300"/>
+        <w:jc w:val="both"/>
+      </w:pPr>
+      <w:r>
+        <w:rPr>
+          <w:i/>
+          <w:iCs/>
+        </w:rPr>
+        <w:t xml:space="preserve">Tipp: Obst nicht offen liegen lassen, Biomüll täglich leeren – dann gibt es kaum Fruchtfliegen.</w:t>
+      </w:r>
+    </w:p>
+    <w:p>
+      <w:pPr>
+        <w:pStyle w:val="Heading2"/>
+      </w:pPr>
+      <w:r>
+        <w:t xml:space="preserve">Ameisen</w:t>
+      </w:r>
+    </w:p>
+    <w:p>
+      <w:pPr>
+        <w:pStyle w:val="ListParagraph"/>
+        <w:numPr>
+          <w:ilvl w:val="0"/>
+          <w:numId w:val="2"/>
+        </w:numPr>
+        <w:spacing w:after="80" w:line="290"/>
+      </w:pPr>
+      <w:r>
+        <w:t xml:space="preserve">Ameisenstraße mit Essigwasser abwischen – das löscht die Duftspur.</w:t>
+      </w:r>
+    </w:p>
+    <w:p>
+      <w:pPr>
+        <w:pStyle w:val="ListParagraph"/>
+        <w:numPr>
+          <w:ilvl w:val="0"/>
+          <w:numId w:val="2"/>
+        </w:numPr>
+        <w:spacing w:after="80" w:line="290"/>
+      </w:pPr>
+      <w:r>
+        <w:rPr>
+          <w:b/>
+          <w:bCs/>
+        </w:rPr>
+        <w:t xml:space="preserve">Duftbarrieren</w:t>
+      </w:r>
+      <w:r>
+        <w:t xml:space="preserve"> aus Zimt, Lavendel, Pfefferminze oder Kreidestrichen an Eintrittsstellen legen.</w:t>
+      </w:r>
+    </w:p>
+    <w:p>
+      <w:pPr>
+        <w:pStyle w:val="ListParagraph"/>
+        <w:numPr>
+          <w:ilvl w:val="0"/>
+          <w:numId w:val="2"/>
+        </w:numPr>
+        <w:spacing w:after="80" w:line="290"/>
+      </w:pPr>
+      <w:r>
+        <w:t xml:space="preserve">Eintrittsstellen (Fugen, Fensterritzen) finden und abdichten.</w:t>
+      </w:r>
+    </w:p>
+    <w:p>
+      <w:pPr>
+        <w:pStyle w:val="ListParagraph"/>
+        <w:numPr>
+          <w:ilvl w:val="0"/>
+          <w:numId w:val="2"/>
+        </w:numPr>
+        <w:spacing w:after="80" w:line="290"/>
+      </w:pPr>
+      <w:r>
+        <w:t xml:space="preserve">Draußen ein Nest umsiedeln: Einen Blumentopf mit Holzwolle umgekehrt auf das Nest stellen, nach einigen Tagen mit einem Spaten unterfahren und weit weg tragen.</w:t>
+      </w:r>
+    </w:p>
+    <w:p>
+      <w:pPr>
+        <w:pStyle w:val="Heading2"/>
+      </w:pPr>
+      <w:r>
+        <w:t xml:space="preserve">Kleidermotten und Lebensmittelmotten</w:t>
+      </w:r>
+    </w:p>
+    <w:p>
+      <w:pPr>
+        <w:pStyle w:val="ListParagraph"/>
+        <w:numPr>
+          <w:ilvl w:val="0"/>
+          <w:numId w:val="2"/>
+        </w:numPr>
+        <w:spacing w:after="80" w:line="290"/>
+      </w:pPr>
+      <w:r>
+        <w:rPr>
+          <w:b/>
+          <w:bCs/>
+        </w:rPr>
+        <w:t xml:space="preserve">Kleidermotten:</w:t>
+      </w:r>
+      <w:r>
+        <w:t xml:space="preserve"> Schrank aussaugen und mit Essigwasser auswischen, Wollsachen einfrieren (2 bis 3 Tage) oder bei 60 °C waschen. Lavendel, Zedernholz und Steinklee (Band 1) halten fern.</w:t>
+      </w:r>
+    </w:p>
+    <w:p>
+      <w:pPr>
+        <w:pStyle w:val="ListParagraph"/>
+        <w:numPr>
+          <w:ilvl w:val="0"/>
+          <w:numId w:val="2"/>
+        </w:numPr>
+        <w:spacing w:after="80" w:line="290"/>
+      </w:pPr>
+      <w:r>
+        <w:rPr>
+          <w:b/>
+          <w:bCs/>
+        </w:rPr>
+        <w:t xml:space="preserve">Lebensmittelmotten:</w:t>
+      </w:r>
+      <w:r>
+        <w:t xml:space="preserve"> Befallene Vorräte im Restmüll entsorgen, Schrank aussaugen und auswischen, Vorräte in dicht schließenden Gläsern lagern. </w:t>
+      </w:r>
+      <w:r>
+        <w:rPr>
+          <w:b/>
+          <w:bCs/>
+        </w:rPr>
+        <w:t xml:space="preserve">Schlupfwespen</w:t>
+      </w:r>
+      <w:r>
+        <w:t xml:space="preserve"> (im Handel) sind natürliche Gegenspieler.</w:t>
+      </w:r>
+    </w:p>
+    <w:p>
+      <w:pPr>
+        <w:pStyle w:val="ListParagraph"/>
+        <w:numPr>
+          <w:ilvl w:val="0"/>
+          <w:numId w:val="2"/>
+        </w:numPr>
+        <w:spacing w:after="80" w:line="290"/>
+      </w:pPr>
+      <w:r>
+        <w:t xml:space="preserve">Pheromonfallen zeigen einen Befall an, bekämpfen ihn aber nicht.</w:t>
       </w:r>
     </w:p>
     <w:p>
       <w:pPr>
         <w:pStyle w:val="Heading3"/>
       </w:pPr>
-      <w:bookmarkStart w:name="r37" w:id="1"/>
-      <w:r>
-        <w:t xml:space="preserve">Schuh-Deo-Säckchen</w:t>
+      <w:bookmarkStart w:name="r39" w:id="1"/>
+      <w:r>
+        <w:t xml:space="preserve">Mottensäckchen</w:t>
       </w:r>
       <w:bookmarkEnd w:id="1"/>
     </w:p>
@@ -11947,7 +12614,7 @@
           <w:i/>
           <w:iCs/>
         </w:rPr>
-        <w:t xml:space="preserve">Für ein Paar Schuhe</w:t>
+        <w:t xml:space="preserve">Für den Kleiderschrank</w:t>
       </w:r>
     </w:p>
     <w:p>
@@ -11972,7 +12639,7 @@
         <w:spacing w:after="80" w:line="290"/>
       </w:pPr>
       <w:r>
-        <w:t xml:space="preserve">2 alte Socken oder kleine Stoffbeutel</w:t>
+        <w:t xml:space="preserve">kleine Baumwollbeutel</w:t>
       </w:r>
     </w:p>
     <w:p>
@@ -11985,7 +12652,7 @@
         <w:spacing w:after="80" w:line="290"/>
       </w:pPr>
       <w:r>
-        <w:t xml:space="preserve">4 EL Natron</w:t>
+        <w:t xml:space="preserve">getrocknete Lavendelblüten, Zedernholzspäne oder Steinklee</w:t>
       </w:r>
     </w:p>
     <w:p>
@@ -11998,7 +12665,7 @@
         <w:spacing w:after="80" w:line="290"/>
       </w:pPr>
       <w:r>
-        <w:t xml:space="preserve">nach Belieben getrocknete Lavendelblüten</w:t>
+        <w:t xml:space="preserve">ein paar Tropfen Lavendelöl zum Auffrischen</w:t>
       </w:r>
     </w:p>
     <w:p>
@@ -12018,333 +12685,12 @@
         <w:pStyle w:val="ListParagraph"/>
         <w:numPr>
           <w:ilvl w:val="0"/>
-          <w:numId w:val="40"/>
-        </w:numPr>
-        <w:spacing w:after="80" w:line="290"/>
-      </w:pPr>
-      <w:r>
-        <w:t xml:space="preserve">Natron (und Lavendel) in die Socken füllen und zuknoten.</w:t>
-      </w:r>
-    </w:p>
-    <w:p>
-      <w:pPr>
-        <w:pStyle w:val="ListParagraph"/>
-        <w:numPr>
-          <w:ilvl w:val="0"/>
-          <w:numId w:val="40"/>
-        </w:numPr>
-        <w:spacing w:after="80" w:line="290"/>
-      </w:pPr>
-      <w:r>
-        <w:t xml:space="preserve">Über Nacht in die Schuhe legen.</w:t>
-      </w:r>
-    </w:p>
-    <w:p>
-      <w:pPr>
-        <w:pStyle w:val="ListParagraph"/>
-        <w:numPr>
-          <w:ilvl w:val="0"/>
-          <w:numId w:val="40"/>
-        </w:numPr>
-        <w:spacing w:after="80" w:line="290"/>
-      </w:pPr>
-      <w:r>
-        <w:t xml:space="preserve">Alle paar Wochen das Natron erneuern.</w:t>
-      </w:r>
-    </w:p>
-    <w:p>
-      <w:pPr>
-        <w:pStyle w:val="Heading3"/>
-      </w:pPr>
-      <w:bookmarkStart w:name="r38" w:id="1"/>
-      <w:r>
-        <w:t xml:space="preserve">Raumduft-Topf (Simmer Pot)</w:t>
-      </w:r>
-      <w:bookmarkEnd w:id="1"/>
-    </w:p>
-    <w:p>
-      <w:pPr>
-        <w:spacing w:after="140" w:line="300"/>
-        <w:jc w:val="left"/>
-      </w:pPr>
-      <w:r>
-        <w:rPr>
-          <w:i/>
-          <w:iCs/>
-        </w:rPr>
-        <w:t xml:space="preserve">Für einen gemütlichen Nachmittag</w:t>
-      </w:r>
-    </w:p>
-    <w:p>
-      <w:pPr>
-        <w:spacing w:after="60"/>
-      </w:pPr>
-      <w:r>
-        <w:rPr>
-          <w:b/>
-          <w:bCs/>
-        </w:rPr>
-        <w:t xml:space="preserve">Du brauchst</w:t>
-      </w:r>
-    </w:p>
-    <w:p>
-      <w:pPr>
-        <w:pStyle w:val="ListParagraph"/>
-        <w:numPr>
-          <w:ilvl w:val="0"/>
-          <w:numId w:val="2"/>
-        </w:numPr>
-        <w:spacing w:after="80" w:line="290"/>
-      </w:pPr>
-      <w:r>
-        <w:t xml:space="preserve">ein Topf mit Wasser</w:t>
-      </w:r>
-    </w:p>
-    <w:p>
-      <w:pPr>
-        <w:pStyle w:val="ListParagraph"/>
-        <w:numPr>
-          <w:ilvl w:val="0"/>
-          <w:numId w:val="2"/>
-        </w:numPr>
-        <w:spacing w:after="80" w:line="290"/>
-      </w:pPr>
-      <w:r>
-        <w:t xml:space="preserve">Orangen- oder Apfelschalen, 1 Zimtstange, ein paar Nelken, ein Zweig Fichte oder Rosmarin</w:t>
-      </w:r>
-    </w:p>
-    <w:p>
-      <w:pPr>
-        <w:spacing w:after="60" w:before="120"/>
-      </w:pPr>
-      <w:r>
-        <w:rPr>
-          <w:b/>
-          <w:bCs/>
-        </w:rPr>
-        <w:t xml:space="preserve">So geht es</w:t>
-      </w:r>
-    </w:p>
-    <w:p>
-      <w:pPr>
-        <w:pStyle w:val="ListParagraph"/>
-        <w:numPr>
-          <w:ilvl w:val="0"/>
-          <w:numId w:val="41"/>
-        </w:numPr>
-        <w:spacing w:after="80" w:line="290"/>
-      </w:pPr>
-      <w:r>
-        <w:t xml:space="preserve">Alles in den Topf geben.</w:t>
-      </w:r>
-    </w:p>
-    <w:p>
-      <w:pPr>
-        <w:pStyle w:val="ListParagraph"/>
-        <w:numPr>
-          <w:ilvl w:val="0"/>
-          <w:numId w:val="41"/>
-        </w:numPr>
-        <w:spacing w:after="80" w:line="290"/>
-      </w:pPr>
-      <w:r>
-        <w:t xml:space="preserve">Auf kleinster Stufe leise köcheln lassen und Wasser nachfüllen.</w:t>
-      </w:r>
-    </w:p>
-    <w:p>
-      <w:pPr>
-        <w:spacing w:after="140" w:line="300"/>
-        <w:jc w:val="both"/>
-      </w:pPr>
-      <w:r>
-        <w:rPr>
-          <w:i/>
-          <w:iCs/>
-        </w:rPr>
-        <w:t xml:space="preserve">Tipp: Nie unbeaufsichtigt lassen. Statt Duftkerzen und Raumsprays – ohne künstliche Duftstoffe.</w:t>
-      </w:r>
-    </w:p>
-    <w:p>
-      <w:pPr>
-        <w:pStyle w:val="Heading2"/>
-      </w:pPr>
-      <w:r>
-        <w:t xml:space="preserve">Schimmel: was du selbst machen kannst – und was nicht</w:t>
-      </w:r>
-    </w:p>
-    <w:p>
-      <w:pPr>
-        <w:spacing w:after="140" w:line="300"/>
-        <w:jc w:val="both"/>
-      </w:pPr>
-      <w:r>
-        <w:t xml:space="preserve">Schimmel ist kein Schönheitsproblem, sondern kann der Gesundheit schaden. Das Umweltbundesamt empfiehlt:</w:t>
-      </w:r>
-    </w:p>
-    <w:p>
-      <w:pPr>
-        <w:pStyle w:val="ListParagraph"/>
-        <w:numPr>
-          <w:ilvl w:val="0"/>
-          <w:numId w:val="2"/>
-        </w:numPr>
-        <w:spacing w:after="80" w:line="290"/>
-      </w:pPr>
-      <w:r>
-        <w:rPr>
-          <w:b/>
-          <w:bCs/>
-        </w:rPr>
-        <w:t xml:space="preserve">Kleine Flächen</w:t>
-      </w:r>
-      <w:r>
-        <w:t xml:space="preserve"> (bis etwa 0,5 m²) auf </w:t>
-      </w:r>
-      <w:r>
-        <w:rPr>
-          <w:b/>
-          <w:bCs/>
-        </w:rPr>
-        <w:t xml:space="preserve">glatten, nicht saugfähigen</w:t>
-      </w:r>
-      <w:r>
-        <w:t xml:space="preserve"> Oberflächen (Fliesen, Fensterrahmen, Silikon) kannst du selbst entfernen.</w:t>
-      </w:r>
-    </w:p>
-    <w:p>
-      <w:pPr>
-        <w:pStyle w:val="ListParagraph"/>
-        <w:numPr>
-          <w:ilvl w:val="0"/>
-          <w:numId w:val="2"/>
-        </w:numPr>
-        <w:spacing w:after="80" w:line="290"/>
-      </w:pPr>
-      <w:r>
-        <w:rPr>
-          <w:b/>
-          <w:bCs/>
-        </w:rPr>
-        <w:t xml:space="preserve">Größere Flächen</w:t>
-      </w:r>
-      <w:r>
-        <w:t xml:space="preserve">, Schimmel in Wänden, unter Tapeten oder nach Wasserschäden gehören in die Hand von </w:t>
-      </w:r>
-      <w:r>
-        <w:rPr>
-          <w:b/>
-          <w:bCs/>
-        </w:rPr>
-        <w:t xml:space="preserve">Fachleuten</w:t>
-      </w:r>
-      <w:r>
-        <w:t xml:space="preserve">. Das gilt auch, wenn Allergiker, Schwangere, kleine Kinder oder Menschen mit geschwächtem Immunsystem im Haushalt leben.</w:t>
-      </w:r>
-    </w:p>
-    <w:p>
-      <w:pPr>
-        <w:pStyle w:val="ListParagraph"/>
-        <w:numPr>
-          <w:ilvl w:val="0"/>
-          <w:numId w:val="2"/>
-        </w:numPr>
-        <w:spacing w:after="80" w:line="290"/>
-      </w:pPr>
-      <w:r>
-        <w:rPr>
-          <w:b/>
-          <w:bCs/>
-        </w:rPr>
-        <w:t xml:space="preserve">Ursache finden:</w:t>
-      </w:r>
-      <w:r>
-        <w:t xml:space="preserve"> zu hohe Luftfeuchtigkeit, Wärmebrücken, undichte Stellen. Ohne die Ursache kommt der Schimmel wieder.</w:t>
-      </w:r>
-    </w:p>
-    <w:p>
-      <w:pPr>
-        <w:pStyle w:val="Heading3"/>
-      </w:pPr>
-      <w:bookmarkStart w:name="r39" w:id="1"/>
-      <w:r>
-        <w:t xml:space="preserve">Kleine Schimmelflecken entfernen</w:t>
-      </w:r>
-      <w:bookmarkEnd w:id="1"/>
-    </w:p>
-    <w:p>
-      <w:pPr>
-        <w:spacing w:after="140" w:line="300"/>
-        <w:jc w:val="left"/>
-      </w:pPr>
-      <w:r>
-        <w:rPr>
-          <w:i/>
-          <w:iCs/>
-        </w:rPr>
-        <w:t xml:space="preserve">Für glatte Oberflächen bis 0,5 m²</w:t>
-      </w:r>
-    </w:p>
-    <w:p>
-      <w:pPr>
-        <w:spacing w:after="60"/>
-      </w:pPr>
-      <w:r>
-        <w:rPr>
-          <w:b/>
-          <w:bCs/>
-        </w:rPr>
-        <w:t xml:space="preserve">Du brauchst</w:t>
-      </w:r>
-    </w:p>
-    <w:p>
-      <w:pPr>
-        <w:pStyle w:val="ListParagraph"/>
-        <w:numPr>
-          <w:ilvl w:val="0"/>
-          <w:numId w:val="2"/>
-        </w:numPr>
-        <w:spacing w:after="80" w:line="290"/>
-      </w:pPr>
-      <w:r>
-        <w:t xml:space="preserve">70- bis 80-prozentiger Ethanol (Weingeist aus der Apotheke)</w:t>
-      </w:r>
-    </w:p>
-    <w:p>
-      <w:pPr>
-        <w:pStyle w:val="ListParagraph"/>
-        <w:numPr>
-          <w:ilvl w:val="0"/>
-          <w:numId w:val="2"/>
-        </w:numPr>
-        <w:spacing w:after="80" w:line="290"/>
-      </w:pPr>
-      <w:r>
-        <w:t xml:space="preserve">Einweg-Tücher, Handschuhe, FFP2-Maske, Schutzbrille</w:t>
-      </w:r>
-    </w:p>
-    <w:p>
-      <w:pPr>
-        <w:spacing w:after="60" w:before="120"/>
-      </w:pPr>
-      <w:r>
-        <w:rPr>
-          <w:b/>
-          <w:bCs/>
-        </w:rPr>
-        <w:t xml:space="preserve">So geht es</w:t>
-      </w:r>
-    </w:p>
-    <w:p>
-      <w:pPr>
-        <w:pStyle w:val="ListParagraph"/>
-        <w:numPr>
-          <w:ilvl w:val="0"/>
           <w:numId w:val="42"/>
         </w:numPr>
         <w:spacing w:after="80" w:line="290"/>
       </w:pPr>
       <w:r>
-        <w:t xml:space="preserve">Fenster öffnen, Schutzausrüstung anziehen.</w:t>
+        <w:t xml:space="preserve">Beutel füllen und zubinden.</w:t>
       </w:r>
     </w:p>
     <w:p>
@@ -12357,17 +12703,7 @@
         <w:spacing w:after="80" w:line="290"/>
       </w:pPr>
       <w:r>
-        <w:t xml:space="preserve">Schimmel </w:t>
-      </w:r>
-      <w:r>
-        <w:rPr>
-          <w:b/>
-          <w:bCs/>
-        </w:rPr>
-        <w:t xml:space="preserve">nicht trocken abbürsten</w:t>
-      </w:r>
-      <w:r>
-        <w:t xml:space="preserve"> – das verteilt die Sporen.</w:t>
+        <w:t xml:space="preserve">Zwischen die Kleidung hängen oder legen.</w:t>
       </w:r>
     </w:p>
     <w:p>
@@ -12376,550 +12712,6 @@
         <w:numPr>
           <w:ilvl w:val="0"/>
           <w:numId w:val="42"/>
-        </w:numPr>
-        <w:spacing w:after="80" w:line="290"/>
-      </w:pPr>
-      <w:r>
-        <w:t xml:space="preserve">Alkohol auf ein Tuch geben und die Fläche abwischen, kurz einwirken lassen, mit einem neuen Tuch nachwischen.</w:t>
-      </w:r>
-    </w:p>
-    <w:p>
-      <w:pPr>
-        <w:pStyle w:val="ListParagraph"/>
-        <w:numPr>
-          <w:ilvl w:val="0"/>
-          <w:numId w:val="42"/>
-        </w:numPr>
-        <w:spacing w:after="80" w:line="290"/>
-      </w:pPr>
-      <w:r>
-        <w:t xml:space="preserve">Tücher in einem verschlossenen Beutel im Restmüll entsorgen.</w:t>
-      </w:r>
-    </w:p>
-    <w:p>
-      <w:pPr>
-        <w:spacing w:after="140" w:line="300"/>
-        <w:jc w:val="both"/>
-      </w:pPr>
-      <w:r>
-        <w:rPr>
-          <w:i/>
-          <w:iCs/>
-        </w:rPr>
-        <w:t xml:space="preserve">Tipp: Ethanol ist – wie im Wein – aus vergorenem Pflanzenzucker gewonnen; hier ist er die eine Ausnahme im Buch, weil das Umweltbundesamt ihn für kleine Schimmelflächen empfiehlt. Er ist entzündlich – keine offenen Flammen, nicht rauchen. </w:t>
-      </w:r>
-      <w:r>
-        <w:rPr>
-          <w:i/>
-          <w:iCs/>
-        </w:rPr>
-        <w:t xml:space="preserve">Essig</w:t>
-      </w:r>
-      <w:r>
-        <w:rPr>
-          <w:i/>
-          <w:iCs/>
-        </w:rPr>
-        <w:t xml:space="preserve"> ist auf kalkhaltigen Wänden ungeeignet: Er wird neutralisiert und kann den Schimmel sogar ernähren.</w:t>
-      </w:r>
-    </w:p>
-    <w:p>
-      <w:pPr>
-        <w:pStyle w:val="Heading2"/>
-      </w:pPr>
-      <w:r>
-        <w:t xml:space="preserve">Richtig lüften und heizen</w:t>
-      </w:r>
-    </w:p>
-    <w:p>
-      <w:pPr>
-        <w:pStyle w:val="ListParagraph"/>
-        <w:numPr>
-          <w:ilvl w:val="0"/>
-          <w:numId w:val="2"/>
-        </w:numPr>
-        <w:spacing w:after="80" w:line="290"/>
-      </w:pPr>
-      <w:r>
-        <w:t xml:space="preserve">Luftfeuchtigkeit mit einem Hygrometer (unter 10 Euro) kontrollieren: Ideal sind 40 bis 60 %.</w:t>
-      </w:r>
-    </w:p>
-    <w:p>
-      <w:pPr>
-        <w:pStyle w:val="ListParagraph"/>
-        <w:numPr>
-          <w:ilvl w:val="0"/>
-          <w:numId w:val="2"/>
-        </w:numPr>
-        <w:spacing w:after="80" w:line="290"/>
-      </w:pPr>
-      <w:r>
-        <w:t xml:space="preserve">Nach dem Duschen, Kochen und Wäschetrocknen sofort stoßlüften.</w:t>
-      </w:r>
-    </w:p>
-    <w:p>
-      <w:pPr>
-        <w:pStyle w:val="ListParagraph"/>
-        <w:numPr>
-          <w:ilvl w:val="0"/>
-          <w:numId w:val="2"/>
-        </w:numPr>
-        <w:spacing w:after="80" w:line="290"/>
-      </w:pPr>
-      <w:r>
-        <w:t xml:space="preserve">Möbel mit etwas Abstand (5 bis 10 cm) zu Außenwänden aufstellen.</w:t>
-      </w:r>
-    </w:p>
-    <w:p>
-      <w:pPr>
-        <w:pStyle w:val="ListParagraph"/>
-        <w:numPr>
-          <w:ilvl w:val="0"/>
-          <w:numId w:val="2"/>
-        </w:numPr>
-        <w:spacing w:after="80" w:line="290"/>
-      </w:pPr>
-      <w:r>
-        <w:t xml:space="preserve">Räume nicht unter 16 °C auskühlen lassen.</w:t>
-      </w:r>
-    </w:p>
-    <w:p>
-      <w:pPr>
-        <w:pStyle w:val="Heading1"/>
-        <w:pageBreakBefore/>
-      </w:pPr>
-      <w:bookmarkStart w:name="k_ungeziefer" w:id="1"/>
-      <w:r>
-        <w:t xml:space="preserve">Ungeziefer im Haus</w:t>
-      </w:r>
-      <w:bookmarkEnd w:id="1"/>
-    </w:p>
-    <w:p>
-      <w:pPr>
-        <w:spacing w:after="140" w:line="300"/>
-        <w:jc w:val="both"/>
-      </w:pPr>
-      <w:r>
-        <w:t xml:space="preserve">Gegen ungebetene Gäste hilft vor allem eines: </w:t>
-      </w:r>
-      <w:r>
-        <w:rPr>
-          <w:b/>
-          <w:bCs/>
-        </w:rPr>
-        <w:t xml:space="preserve">Vorbeugung.</w:t>
-      </w:r>
-      <w:r>
-        <w:t xml:space="preserve"> Lebensmittel dicht verschließen, Krümel wegwischen, Ritzen abdichten. Für den Rest gibt es sanfte Hausmittel.</w:t>
-      </w:r>
-    </w:p>
-    <w:p>
-      <w:pPr>
-        <w:pStyle w:val="Heading3"/>
-      </w:pPr>
-      <w:bookmarkStart w:name="r40" w:id="1"/>
-      <w:r>
-        <w:t xml:space="preserve">Fruchtfliegenfalle</w:t>
-      </w:r>
-      <w:bookmarkEnd w:id="1"/>
-    </w:p>
-    <w:p>
-      <w:pPr>
-        <w:spacing w:after="140" w:line="300"/>
-        <w:jc w:val="left"/>
-      </w:pPr>
-      <w:r>
-        <w:rPr>
-          <w:i/>
-          <w:iCs/>
-        </w:rPr>
-        <w:t xml:space="preserve">Für die Küche im Spätsommer</w:t>
-      </w:r>
-    </w:p>
-    <w:p>
-      <w:pPr>
-        <w:spacing w:after="60"/>
-      </w:pPr>
-      <w:r>
-        <w:rPr>
-          <w:b/>
-          <w:bCs/>
-        </w:rPr>
-        <w:t xml:space="preserve">Du brauchst</w:t>
-      </w:r>
-    </w:p>
-    <w:p>
-      <w:pPr>
-        <w:pStyle w:val="ListParagraph"/>
-        <w:numPr>
-          <w:ilvl w:val="0"/>
-          <w:numId w:val="2"/>
-        </w:numPr>
-        <w:spacing w:after="80" w:line="290"/>
-      </w:pPr>
-      <w:r>
-        <w:t xml:space="preserve">ein kleines Glas</w:t>
-      </w:r>
-    </w:p>
-    <w:p>
-      <w:pPr>
-        <w:pStyle w:val="ListParagraph"/>
-        <w:numPr>
-          <w:ilvl w:val="0"/>
-          <w:numId w:val="2"/>
-        </w:numPr>
-        <w:spacing w:after="80" w:line="290"/>
-      </w:pPr>
-      <w:r>
-        <w:t xml:space="preserve">3 EL Apfelessig</w:t>
-      </w:r>
-    </w:p>
-    <w:p>
-      <w:pPr>
-        <w:pStyle w:val="ListParagraph"/>
-        <w:numPr>
-          <w:ilvl w:val="0"/>
-          <w:numId w:val="2"/>
-        </w:numPr>
-        <w:spacing w:after="80" w:line="290"/>
-      </w:pPr>
-      <w:r>
-        <w:t xml:space="preserve">2 EL Saft oder etwas Obst</w:t>
-      </w:r>
-    </w:p>
-    <w:p>
-      <w:pPr>
-        <w:pStyle w:val="ListParagraph"/>
-        <w:numPr>
-          <w:ilvl w:val="0"/>
-          <w:numId w:val="2"/>
-        </w:numPr>
-        <w:spacing w:after="80" w:line="290"/>
-      </w:pPr>
-      <w:r>
-        <w:t xml:space="preserve">1 TL Kastanien-, Efeu- oder Waschnusssud</w:t>
-      </w:r>
-    </w:p>
-    <w:p>
-      <w:pPr>
-        <w:spacing w:after="60" w:before="120"/>
-      </w:pPr>
-      <w:r>
-        <w:rPr>
-          <w:b/>
-          <w:bCs/>
-        </w:rPr>
-        <w:t xml:space="preserve">So geht es</w:t>
-      </w:r>
-    </w:p>
-    <w:p>
-      <w:pPr>
-        <w:pStyle w:val="ListParagraph"/>
-        <w:numPr>
-          <w:ilvl w:val="0"/>
-          <w:numId w:val="43"/>
-        </w:numPr>
-        <w:spacing w:after="80" w:line="290"/>
-      </w:pPr>
-      <w:r>
-        <w:t xml:space="preserve">Essig und Saft ins Glas geben, den Sud dazugeben – er bricht die Oberflächenspannung, sodass die Fliegen nicht wieder hochkommen.</w:t>
-      </w:r>
-    </w:p>
-    <w:p>
-      <w:pPr>
-        <w:pStyle w:val="ListParagraph"/>
-        <w:numPr>
-          <w:ilvl w:val="0"/>
-          <w:numId w:val="43"/>
-        </w:numPr>
-        <w:spacing w:after="80" w:line="290"/>
-      </w:pPr>
-      <w:r>
-        <w:t xml:space="preserve">Glas neben die Obstschale stellen.</w:t>
-      </w:r>
-    </w:p>
-    <w:p>
-      <w:pPr>
-        <w:pStyle w:val="ListParagraph"/>
-        <w:numPr>
-          <w:ilvl w:val="0"/>
-          <w:numId w:val="43"/>
-        </w:numPr>
-        <w:spacing w:after="80" w:line="290"/>
-      </w:pPr>
-      <w:r>
-        <w:t xml:space="preserve">Alle paar Tage erneuern.</w:t>
-      </w:r>
-    </w:p>
-    <w:p>
-      <w:pPr>
-        <w:spacing w:after="140" w:line="300"/>
-        <w:jc w:val="both"/>
-      </w:pPr>
-      <w:r>
-        <w:rPr>
-          <w:i/>
-          <w:iCs/>
-        </w:rPr>
-        <w:t xml:space="preserve">Tipp: Obst nicht offen liegen lassen, Biomüll täglich leeren – dann gibt es kaum Fruchtfliegen.</w:t>
-      </w:r>
-    </w:p>
-    <w:p>
-      <w:pPr>
-        <w:pStyle w:val="Heading2"/>
-      </w:pPr>
-      <w:r>
-        <w:t xml:space="preserve">Ameisen</w:t>
-      </w:r>
-    </w:p>
-    <w:p>
-      <w:pPr>
-        <w:pStyle w:val="ListParagraph"/>
-        <w:numPr>
-          <w:ilvl w:val="0"/>
-          <w:numId w:val="2"/>
-        </w:numPr>
-        <w:spacing w:after="80" w:line="290"/>
-      </w:pPr>
-      <w:r>
-        <w:t xml:space="preserve">Ameisenstraße mit Essigwasser abwischen – das löscht die Duftspur.</w:t>
-      </w:r>
-    </w:p>
-    <w:p>
-      <w:pPr>
-        <w:pStyle w:val="ListParagraph"/>
-        <w:numPr>
-          <w:ilvl w:val="0"/>
-          <w:numId w:val="2"/>
-        </w:numPr>
-        <w:spacing w:after="80" w:line="290"/>
-      </w:pPr>
-      <w:r>
-        <w:rPr>
-          <w:b/>
-          <w:bCs/>
-        </w:rPr>
-        <w:t xml:space="preserve">Duftbarrieren</w:t>
-      </w:r>
-      <w:r>
-        <w:t xml:space="preserve"> aus Zimt, Lavendel, Pfefferminze oder Kreidestrichen an Eintrittsstellen legen.</w:t>
-      </w:r>
-    </w:p>
-    <w:p>
-      <w:pPr>
-        <w:pStyle w:val="ListParagraph"/>
-        <w:numPr>
-          <w:ilvl w:val="0"/>
-          <w:numId w:val="2"/>
-        </w:numPr>
-        <w:spacing w:after="80" w:line="290"/>
-      </w:pPr>
-      <w:r>
-        <w:t xml:space="preserve">Eintrittsstellen (Fugen, Fensterritzen) finden und abdichten.</w:t>
-      </w:r>
-    </w:p>
-    <w:p>
-      <w:pPr>
-        <w:pStyle w:val="ListParagraph"/>
-        <w:numPr>
-          <w:ilvl w:val="0"/>
-          <w:numId w:val="2"/>
-        </w:numPr>
-        <w:spacing w:after="80" w:line="290"/>
-      </w:pPr>
-      <w:r>
-        <w:t xml:space="preserve">Draußen ein Nest umsiedeln: Einen Blumentopf mit Holzwolle umgekehrt auf das Nest stellen, nach einigen Tagen mit einem Spaten unterfahren und weit weg tragen.</w:t>
-      </w:r>
-    </w:p>
-    <w:p>
-      <w:pPr>
-        <w:pStyle w:val="Heading2"/>
-      </w:pPr>
-      <w:r>
-        <w:t xml:space="preserve">Kleidermotten und Lebensmittelmotten</w:t>
-      </w:r>
-    </w:p>
-    <w:p>
-      <w:pPr>
-        <w:pStyle w:val="ListParagraph"/>
-        <w:numPr>
-          <w:ilvl w:val="0"/>
-          <w:numId w:val="2"/>
-        </w:numPr>
-        <w:spacing w:after="80" w:line="290"/>
-      </w:pPr>
-      <w:r>
-        <w:rPr>
-          <w:b/>
-          <w:bCs/>
-        </w:rPr>
-        <w:t xml:space="preserve">Kleidermotten:</w:t>
-      </w:r>
-      <w:r>
-        <w:t xml:space="preserve"> Schrank aussaugen und mit Essigwasser auswischen, Wollsachen einfrieren (2 bis 3 Tage) oder bei 60 °C waschen. Lavendel, Zedernholz und Steinklee (Band 1) halten fern.</w:t>
-      </w:r>
-    </w:p>
-    <w:p>
-      <w:pPr>
-        <w:pStyle w:val="ListParagraph"/>
-        <w:numPr>
-          <w:ilvl w:val="0"/>
-          <w:numId w:val="2"/>
-        </w:numPr>
-        <w:spacing w:after="80" w:line="290"/>
-      </w:pPr>
-      <w:r>
-        <w:rPr>
-          <w:b/>
-          <w:bCs/>
-        </w:rPr>
-        <w:t xml:space="preserve">Lebensmittelmotten:</w:t>
-      </w:r>
-      <w:r>
-        <w:t xml:space="preserve"> Befallene Vorräte im Restmüll entsorgen, Schrank aussaugen und auswischen, Vorräte in dicht schließenden Gläsern lagern. </w:t>
-      </w:r>
-      <w:r>
-        <w:rPr>
-          <w:b/>
-          <w:bCs/>
-        </w:rPr>
-        <w:t xml:space="preserve">Schlupfwespen</w:t>
-      </w:r>
-      <w:r>
-        <w:t xml:space="preserve"> (im Handel) sind natürliche Gegenspieler.</w:t>
-      </w:r>
-    </w:p>
-    <w:p>
-      <w:pPr>
-        <w:pStyle w:val="ListParagraph"/>
-        <w:numPr>
-          <w:ilvl w:val="0"/>
-          <w:numId w:val="2"/>
-        </w:numPr>
-        <w:spacing w:after="80" w:line="290"/>
-      </w:pPr>
-      <w:r>
-        <w:t xml:space="preserve">Pheromonfallen zeigen einen Befall an, bekämpfen ihn aber nicht.</w:t>
-      </w:r>
-    </w:p>
-    <w:p>
-      <w:pPr>
-        <w:pStyle w:val="Heading3"/>
-      </w:pPr>
-      <w:bookmarkStart w:name="r41" w:id="1"/>
-      <w:r>
-        <w:t xml:space="preserve">Mottensäckchen</w:t>
-      </w:r>
-      <w:bookmarkEnd w:id="1"/>
-    </w:p>
-    <w:p>
-      <w:pPr>
-        <w:spacing w:after="140" w:line="300"/>
-        <w:jc w:val="left"/>
-      </w:pPr>
-      <w:r>
-        <w:rPr>
-          <w:i/>
-          <w:iCs/>
-        </w:rPr>
-        <w:t xml:space="preserve">Für den Kleiderschrank</w:t>
-      </w:r>
-    </w:p>
-    <w:p>
-      <w:pPr>
-        <w:spacing w:after="60"/>
-      </w:pPr>
-      <w:r>
-        <w:rPr>
-          <w:b/>
-          <w:bCs/>
-        </w:rPr>
-        <w:t xml:space="preserve">Du brauchst</w:t>
-      </w:r>
-    </w:p>
-    <w:p>
-      <w:pPr>
-        <w:pStyle w:val="ListParagraph"/>
-        <w:numPr>
-          <w:ilvl w:val="0"/>
-          <w:numId w:val="2"/>
-        </w:numPr>
-        <w:spacing w:after="80" w:line="290"/>
-      </w:pPr>
-      <w:r>
-        <w:t xml:space="preserve">kleine Baumwollbeutel</w:t>
-      </w:r>
-    </w:p>
-    <w:p>
-      <w:pPr>
-        <w:pStyle w:val="ListParagraph"/>
-        <w:numPr>
-          <w:ilvl w:val="0"/>
-          <w:numId w:val="2"/>
-        </w:numPr>
-        <w:spacing w:after="80" w:line="290"/>
-      </w:pPr>
-      <w:r>
-        <w:t xml:space="preserve">getrocknete Lavendelblüten, Zedernholzspäne oder Steinklee</w:t>
-      </w:r>
-    </w:p>
-    <w:p>
-      <w:pPr>
-        <w:pStyle w:val="ListParagraph"/>
-        <w:numPr>
-          <w:ilvl w:val="0"/>
-          <w:numId w:val="2"/>
-        </w:numPr>
-        <w:spacing w:after="80" w:line="290"/>
-      </w:pPr>
-      <w:r>
-        <w:t xml:space="preserve">ein paar Tropfen Lavendelöl zum Auffrischen</w:t>
-      </w:r>
-    </w:p>
-    <w:p>
-      <w:pPr>
-        <w:spacing w:after="60" w:before="120"/>
-      </w:pPr>
-      <w:r>
-        <w:rPr>
-          <w:b/>
-          <w:bCs/>
-        </w:rPr>
-        <w:t xml:space="preserve">So geht es</w:t>
-      </w:r>
-    </w:p>
-    <w:p>
-      <w:pPr>
-        <w:pStyle w:val="ListParagraph"/>
-        <w:numPr>
-          <w:ilvl w:val="0"/>
-          <w:numId w:val="44"/>
-        </w:numPr>
-        <w:spacing w:after="80" w:line="290"/>
-      </w:pPr>
-      <w:r>
-        <w:t xml:space="preserve">Beutel füllen und zubinden.</w:t>
-      </w:r>
-    </w:p>
-    <w:p>
-      <w:pPr>
-        <w:pStyle w:val="ListParagraph"/>
-        <w:numPr>
-          <w:ilvl w:val="0"/>
-          <w:numId w:val="44"/>
-        </w:numPr>
-        <w:spacing w:after="80" w:line="290"/>
-      </w:pPr>
-      <w:r>
-        <w:t xml:space="preserve">Zwischen die Kleidung hängen oder legen.</w:t>
-      </w:r>
-    </w:p>
-    <w:p>
-      <w:pPr>
-        <w:pStyle w:val="ListParagraph"/>
-        <w:numPr>
-          <w:ilvl w:val="0"/>
-          <w:numId w:val="44"/>
         </w:numPr>
         <w:spacing w:after="80" w:line="290"/>
       </w:pPr>
@@ -14463,7 +14255,7 @@
       <w:pPr>
         <w:pStyle w:val="Heading3"/>
       </w:pPr>
-      <w:bookmarkStart w:name="r42" w:id="1"/>
+      <w:bookmarkStart w:name="r40" w:id="1"/>
       <w:r>
         <w:t xml:space="preserve">Die Grund-Sprühflaschen für den Alltag</w:t>
       </w:r>
@@ -14563,7 +14355,7 @@
         <w:pStyle w:val="ListParagraph"/>
         <w:numPr>
           <w:ilvl w:val="0"/>
-          <w:numId w:val="45"/>
+          <w:numId w:val="43"/>
         </w:numPr>
         <w:spacing w:after="80" w:line="290"/>
       </w:pPr>
@@ -14586,7 +14378,7 @@
         <w:pStyle w:val="ListParagraph"/>
         <w:numPr>
           <w:ilvl w:val="0"/>
-          <w:numId w:val="45"/>
+          <w:numId w:val="43"/>
         </w:numPr>
         <w:spacing w:after="80" w:line="290"/>
       </w:pPr>
@@ -14599,7 +14391,7 @@
         <w:pStyle w:val="ListParagraph"/>
         <w:numPr>
           <w:ilvl w:val="0"/>
-          <w:numId w:val="45"/>
+          <w:numId w:val="43"/>
         </w:numPr>
         <w:spacing w:after="80" w:line="290"/>
       </w:pPr>
@@ -14929,9 +14721,9 @@
               </w:rPr>
               <w:t xml:space="preserve">S. </w:t>
             </w:r>
-            <w:fldSimple w:instr="PAGEREF r19 \h">
+            <w:fldSimple w:instr="PAGEREF r17 \h">
               <w:r>
-                <w:t xml:space="preserve">26</w:t>
+                <w:t xml:space="preserve">25</w:t>
               </w:r>
             </w:fldSimple>
           </w:p>
@@ -15030,9 +14822,9 @@
               </w:rPr>
               <w:t xml:space="preserve">S. </w:t>
             </w:r>
-            <w:fldSimple w:instr="PAGEREF r42 \h">
+            <w:fldSimple w:instr="PAGEREF r40 \h">
               <w:r>
-                <w:t xml:space="preserve">45</w:t>
+                <w:t xml:space="preserve">44</w:t>
               </w:r>
             </w:fldSimple>
           </w:p>
@@ -15333,9 +15125,9 @@
               </w:rPr>
               <w:t xml:space="preserve">S. </w:t>
             </w:r>
-            <w:fldSimple w:instr="PAGEREF r31 \h">
+            <w:fldSimple w:instr="PAGEREF r29 \h">
               <w:r>
-                <w:t xml:space="preserve">36</w:t>
+                <w:t xml:space="preserve">35</w:t>
               </w:r>
             </w:fldSimple>
           </w:p>
@@ -15535,9 +15327,9 @@
               </w:rPr>
               <w:t xml:space="preserve">S. </w:t>
             </w:r>
-            <w:fldSimple w:instr="PAGEREF r21 \h">
+            <w:fldSimple w:instr="PAGEREF r19 \h">
               <w:r>
-                <w:t xml:space="preserve">29</w:t>
+                <w:t xml:space="preserve">28</w:t>
               </w:r>
             </w:fldSimple>
           </w:p>
@@ -15838,9 +15630,9 @@
               </w:rPr>
               <w:t xml:space="preserve">S. </w:t>
             </w:r>
-            <w:fldSimple w:instr="PAGEREF r12 \h">
+            <w:fldSimple w:instr="PAGEREF r10 \h">
               <w:r>
-                <w:t xml:space="preserve">22</w:t>
+                <w:t xml:space="preserve">21</w:t>
               </w:r>
             </w:fldSimple>
           </w:p>
@@ -15939,9 +15731,9 @@
               </w:rPr>
               <w:t xml:space="preserve">S. </w:t>
             </w:r>
-            <w:fldSimple w:instr="PAGEREF r26 \h">
+            <w:fldSimple w:instr="PAGEREF r24 \h">
               <w:r>
-                <w:t xml:space="preserve">31</w:t>
+                <w:t xml:space="preserve">30</w:t>
               </w:r>
             </w:fldSimple>
           </w:p>
@@ -16040,9 +15832,9 @@
               </w:rPr>
               <w:t xml:space="preserve">S. </w:t>
             </w:r>
-            <w:fldSimple w:instr="PAGEREF r28 \h">
+            <w:fldSimple w:instr="PAGEREF r26 \h">
               <w:r>
-                <w:t xml:space="preserve">34</w:t>
+                <w:t xml:space="preserve">33</w:t>
               </w:r>
             </w:fldSimple>
           </w:p>
@@ -16141,9 +15933,9 @@
               </w:rPr>
               <w:t xml:space="preserve">S. </w:t>
             </w:r>
-            <w:fldSimple w:instr="PAGEREF r29 \h">
+            <w:fldSimple w:instr="PAGEREF r27 \h">
               <w:r>
-                <w:t xml:space="preserve">34</w:t>
+                <w:t xml:space="preserve">33</w:t>
               </w:r>
             </w:fldSimple>
           </w:p>
@@ -16819,7 +16611,7 @@
                 <w:sz w:val="18"/>
                 <w:szCs w:val="18"/>
               </w:rPr>
-              <w:t xml:space="preserve">Lanolin-Kur für Wolle (Wollwalk, Windeln)</w:t>
+              <w:t xml:space="preserve">Mildes Woll- und Feinwaschmittel</w:t>
             </w:r>
           </w:p>
         </w:tc>
@@ -16881,211 +16673,9 @@
               </w:rPr>
               <w:t xml:space="preserve">S. </w:t>
             </w:r>
-            <w:fldSimple w:instr="PAGEREF r11 \h">
+            <w:fldSimple w:instr="PAGEREF r9 \h">
               <w:r>
                 <w:t xml:space="preserve">19</w:t>
-              </w:r>
-            </w:fldSimple>
-          </w:p>
-        </w:tc>
-      </w:tr>
-      <w:tr>
-        <w:trPr>
-          <w:cantSplit/>
-          <w:tblHeader w:val="false"/>
-        </w:trPr>
-        <w:tc>
-          <w:tcPr>
-            <w:tcW w:type="dxa" w:w="5000"/>
-            <w:tcBorders>
-              <w:top w:val="single" w:color="C9C2AE" w:sz="4"/>
-              <w:left w:val="single" w:color="C9C2AE" w:sz="4"/>
-              <w:bottom w:val="single" w:color="C9C2AE" w:sz="4"/>
-              <w:right w:val="single" w:color="C9C2AE" w:sz="4"/>
-            </w:tcBorders>
-            <w:tcMar>
-              <w:top w:type="dxa" w:w="40"/>
-              <w:left w:type="dxa" w:w="40"/>
-              <w:bottom w:type="dxa" w:w="40"/>
-              <w:right w:type="dxa" w:w="40"/>
-            </w:tcMar>
-          </w:tcPr>
-          <w:p>
-            <w:pPr>
-              <w:spacing w:after="0" w:line="260"/>
-              <w:jc w:val="left"/>
-            </w:pPr>
-            <w:r>
-              <w:rPr>
-                <w:sz w:val="18"/>
-                <w:szCs w:val="18"/>
-              </w:rPr>
-              <w:t xml:space="preserve">Mildes Woll- und Feinwaschmittel</w:t>
-            </w:r>
-          </w:p>
-        </w:tc>
-        <w:tc>
-          <w:tcPr>
-            <w:tcW w:type="dxa" w:w="2670"/>
-            <w:tcBorders>
-              <w:top w:val="single" w:color="C9C2AE" w:sz="4"/>
-              <w:left w:val="single" w:color="C9C2AE" w:sz="4"/>
-              <w:bottom w:val="single" w:color="C9C2AE" w:sz="4"/>
-              <w:right w:val="single" w:color="C9C2AE" w:sz="4"/>
-            </w:tcBorders>
-            <w:tcMar>
-              <w:top w:type="dxa" w:w="40"/>
-              <w:left w:type="dxa" w:w="40"/>
-              <w:bottom w:type="dxa" w:w="40"/>
-              <w:right w:type="dxa" w:w="40"/>
-            </w:tcMar>
-          </w:tcPr>
-          <w:p>
-            <w:pPr>
-              <w:spacing w:after="0" w:line="260"/>
-              <w:jc w:val="left"/>
-            </w:pPr>
-            <w:r>
-              <w:rPr>
-                <w:sz w:val="18"/>
-                <w:szCs w:val="18"/>
-              </w:rPr>
-              <w:t xml:space="preserve">Wolle und Feines</w:t>
-            </w:r>
-          </w:p>
-        </w:tc>
-        <w:tc>
-          <w:tcPr>
-            <w:tcW w:type="dxa" w:w="1400"/>
-            <w:tcBorders>
-              <w:top w:val="single" w:color="C9C2AE" w:sz="4"/>
-              <w:left w:val="single" w:color="C9C2AE" w:sz="4"/>
-              <w:bottom w:val="single" w:color="C9C2AE" w:sz="4"/>
-              <w:right w:val="single" w:color="C9C2AE" w:sz="4"/>
-            </w:tcBorders>
-            <w:tcMar>
-              <w:top w:type="dxa" w:w="40"/>
-              <w:left w:type="dxa" w:w="40"/>
-              <w:bottom w:type="dxa" w:w="40"/>
-              <w:right w:type="dxa" w:w="40"/>
-            </w:tcMar>
-          </w:tcPr>
-          <w:p>
-            <w:pPr>
-              <w:spacing w:after="0" w:line="260"/>
-              <w:jc w:val="left"/>
-            </w:pPr>
-            <w:r>
-              <w:rPr>
-                <w:sz w:val="18"/>
-                <w:szCs w:val="18"/>
-              </w:rPr>
-              <w:t xml:space="preserve">S. </w:t>
-            </w:r>
-            <w:fldSimple w:instr="PAGEREF r10 \h">
-              <w:r>
-                <w:t xml:space="preserve">19</w:t>
-              </w:r>
-            </w:fldSimple>
-          </w:p>
-        </w:tc>
-      </w:tr>
-      <w:tr>
-        <w:trPr>
-          <w:cantSplit/>
-          <w:tblHeader w:val="false"/>
-        </w:trPr>
-        <w:tc>
-          <w:tcPr>
-            <w:tcW w:type="dxa" w:w="5000"/>
-            <w:tcBorders>
-              <w:top w:val="single" w:color="C9C2AE" w:sz="4"/>
-              <w:left w:val="single" w:color="C9C2AE" w:sz="4"/>
-              <w:bottom w:val="single" w:color="C9C2AE" w:sz="4"/>
-              <w:right w:val="single" w:color="C9C2AE" w:sz="4"/>
-            </w:tcBorders>
-            <w:tcMar>
-              <w:top w:type="dxa" w:w="40"/>
-              <w:left w:type="dxa" w:w="40"/>
-              <w:bottom w:type="dxa" w:w="40"/>
-              <w:right w:type="dxa" w:w="40"/>
-            </w:tcMar>
-          </w:tcPr>
-          <w:p>
-            <w:pPr>
-              <w:spacing w:after="0" w:line="260"/>
-              <w:jc w:val="left"/>
-            </w:pPr>
-            <w:r>
-              <w:rPr>
-                <w:sz w:val="18"/>
-                <w:szCs w:val="18"/>
-              </w:rPr>
-              <w:t xml:space="preserve">Waschbälle und Trocknerbälle aus Wolle</w:t>
-            </w:r>
-          </w:p>
-        </w:tc>
-        <w:tc>
-          <w:tcPr>
-            <w:tcW w:type="dxa" w:w="2670"/>
-            <w:tcBorders>
-              <w:top w:val="single" w:color="C9C2AE" w:sz="4"/>
-              <w:left w:val="single" w:color="C9C2AE" w:sz="4"/>
-              <w:bottom w:val="single" w:color="C9C2AE" w:sz="4"/>
-              <w:right w:val="single" w:color="C9C2AE" w:sz="4"/>
-            </w:tcBorders>
-            <w:tcMar>
-              <w:top w:type="dxa" w:w="40"/>
-              <w:left w:type="dxa" w:w="40"/>
-              <w:bottom w:type="dxa" w:w="40"/>
-              <w:right w:type="dxa" w:w="40"/>
-            </w:tcMar>
-          </w:tcPr>
-          <w:p>
-            <w:pPr>
-              <w:spacing w:after="0" w:line="260"/>
-              <w:jc w:val="left"/>
-            </w:pPr>
-            <w:r>
-              <w:rPr>
-                <w:sz w:val="18"/>
-                <w:szCs w:val="18"/>
-              </w:rPr>
-              <w:t xml:space="preserve">Wäschepflege</w:t>
-            </w:r>
-          </w:p>
-        </w:tc>
-        <w:tc>
-          <w:tcPr>
-            <w:tcW w:type="dxa" w:w="1400"/>
-            <w:tcBorders>
-              <w:top w:val="single" w:color="C9C2AE" w:sz="4"/>
-              <w:left w:val="single" w:color="C9C2AE" w:sz="4"/>
-              <w:bottom w:val="single" w:color="C9C2AE" w:sz="4"/>
-              <w:right w:val="single" w:color="C9C2AE" w:sz="4"/>
-            </w:tcBorders>
-            <w:tcMar>
-              <w:top w:type="dxa" w:w="40"/>
-              <w:left w:type="dxa" w:w="40"/>
-              <w:bottom w:type="dxa" w:w="40"/>
-              <w:right w:type="dxa" w:w="40"/>
-            </w:tcMar>
-          </w:tcPr>
-          <w:p>
-            <w:pPr>
-              <w:spacing w:after="0" w:line="260"/>
-              <w:jc w:val="left"/>
-            </w:pPr>
-            <w:r>
-              <w:rPr>
-                <w:sz w:val="18"/>
-                <w:szCs w:val="18"/>
-              </w:rPr>
-              <w:t xml:space="preserve">S. </w:t>
-            </w:r>
-            <w:fldSimple w:instr="PAGEREF r9 \h">
-              <w:r>
-                <w:t xml:space="preserve">18</w:t>
               </w:r>
             </w:fldSimple>
           </w:p>
@@ -17856,9 +17446,9 @@
               </w:rPr>
               <w:t xml:space="preserve">S. </w:t>
             </w:r>
-            <w:fldSimple w:instr="PAGEREF r19 \h">
+            <w:fldSimple w:instr="PAGEREF r17 \h">
               <w:r>
-                <w:t xml:space="preserve">26</w:t>
+                <w:t xml:space="preserve">25</w:t>
               </w:r>
             </w:fldSimple>
           </w:p>
@@ -17957,9 +17547,9 @@
               </w:rPr>
               <w:t xml:space="preserve">S. </w:t>
             </w:r>
-            <w:fldSimple w:instr="PAGEREF r15 \h">
+            <w:fldSimple w:instr="PAGEREF r13 \h">
               <w:r>
-                <w:t xml:space="preserve">24</w:t>
+                <w:t xml:space="preserve">23</w:t>
               </w:r>
             </w:fldSimple>
           </w:p>
@@ -18058,9 +17648,9 @@
               </w:rPr>
               <w:t xml:space="preserve">S. </w:t>
             </w:r>
-            <w:fldSimple w:instr="PAGEREF r16 \h">
+            <w:fldSimple w:instr="PAGEREF r14 \h">
               <w:r>
-                <w:t xml:space="preserve">24</w:t>
+                <w:t xml:space="preserve">23</w:t>
               </w:r>
             </w:fldSimple>
           </w:p>
@@ -18159,9 +17749,9 @@
               </w:rPr>
               <w:t xml:space="preserve">S. </w:t>
             </w:r>
-            <w:fldSimple w:instr="PAGEREF r18 \h">
+            <w:fldSimple w:instr="PAGEREF r16 \h">
               <w:r>
-                <w:t xml:space="preserve">26</w:t>
+                <w:t xml:space="preserve">25</w:t>
               </w:r>
             </w:fldSimple>
           </w:p>
@@ -18260,9 +17850,9 @@
               </w:rPr>
               <w:t xml:space="preserve">S. </w:t>
             </w:r>
-            <w:fldSimple w:instr="PAGEREF r17 \h">
+            <w:fldSimple w:instr="PAGEREF r15 \h">
               <w:r>
-                <w:t xml:space="preserve">25</w:t>
+                <w:t xml:space="preserve">24</w:t>
               </w:r>
             </w:fldSimple>
           </w:p>
@@ -18361,9 +17951,9 @@
               </w:rPr>
               <w:t xml:space="preserve">S. </w:t>
             </w:r>
-            <w:fldSimple w:instr="PAGEREF r20 \h">
+            <w:fldSimple w:instr="PAGEREF r18 \h">
               <w:r>
-                <w:t xml:space="preserve">27</w:t>
+                <w:t xml:space="preserve">26</w:t>
               </w:r>
             </w:fldSimple>
           </w:p>
@@ -18462,9 +18052,9 @@
               </w:rPr>
               <w:t xml:space="preserve">S. </w:t>
             </w:r>
-            <w:fldSimple w:instr="PAGEREF r14 \h">
+            <w:fldSimple w:instr="PAGEREF r12 \h">
               <w:r>
-                <w:t xml:space="preserve">23</w:t>
+                <w:t xml:space="preserve">22</w:t>
               </w:r>
             </w:fldSimple>
           </w:p>
@@ -18563,9 +18153,9 @@
               </w:rPr>
               <w:t xml:space="preserve">S. </w:t>
             </w:r>
-            <w:fldSimple w:instr="PAGEREF r13 \h">
+            <w:fldSimple w:instr="PAGEREF r11 \h">
               <w:r>
-                <w:t xml:space="preserve">22</w:t>
+                <w:t xml:space="preserve">21</w:t>
               </w:r>
             </w:fldSimple>
           </w:p>
@@ -18664,9 +18254,9 @@
               </w:rPr>
               <w:t xml:space="preserve">S. </w:t>
             </w:r>
-            <w:fldSimple w:instr="PAGEREF r12 \h">
+            <w:fldSimple w:instr="PAGEREF r10 \h">
               <w:r>
-                <w:t xml:space="preserve">22</w:t>
+                <w:t xml:space="preserve">21</w:t>
               </w:r>
             </w:fldSimple>
           </w:p>
@@ -18765,9 +18355,9 @@
               </w:rPr>
               <w:t xml:space="preserve">S. </w:t>
             </w:r>
-            <w:fldSimple w:instr="PAGEREF r23 \h">
+            <w:fldSimple w:instr="PAGEREF r21 \h">
               <w:r>
-                <w:t xml:space="preserve">29</w:t>
+                <w:t xml:space="preserve">28</w:t>
               </w:r>
             </w:fldSimple>
           </w:p>
@@ -19000,9 +18590,9 @@
               </w:rPr>
               <w:t xml:space="preserve">S. </w:t>
             </w:r>
-            <w:fldSimple w:instr="PAGEREF r24 \h">
+            <w:fldSimple w:instr="PAGEREF r22 \h">
               <w:r>
-                <w:t xml:space="preserve">30</w:t>
+                <w:t xml:space="preserve">29</w:t>
               </w:r>
             </w:fldSimple>
           </w:p>
@@ -19101,9 +18691,9 @@
               </w:rPr>
               <w:t xml:space="preserve">S. </w:t>
             </w:r>
-            <w:fldSimple w:instr="PAGEREF r22 \h">
+            <w:fldSimple w:instr="PAGEREF r20 \h">
               <w:r>
-                <w:t xml:space="preserve">29</w:t>
+                <w:t xml:space="preserve">28</w:t>
               </w:r>
             </w:fldSimple>
           </w:p>
@@ -19202,9 +18792,9 @@
               </w:rPr>
               <w:t xml:space="preserve">S. </w:t>
             </w:r>
-            <w:fldSimple w:instr="PAGEREF r21 \h">
+            <w:fldSimple w:instr="PAGEREF r19 \h">
               <w:r>
-                <w:t xml:space="preserve">29</w:t>
+                <w:t xml:space="preserve">28</w:t>
               </w:r>
             </w:fldSimple>
           </w:p>
@@ -19303,9 +18893,9 @@
               </w:rPr>
               <w:t xml:space="preserve">S. </w:t>
             </w:r>
-            <w:fldSimple w:instr="PAGEREF r27 \h">
+            <w:fldSimple w:instr="PAGEREF r25 \h">
               <w:r>
-                <w:t xml:space="preserve">32</w:t>
+                <w:t xml:space="preserve">31</w:t>
               </w:r>
             </w:fldSimple>
           </w:p>
@@ -19404,9 +18994,9 @@
               </w:rPr>
               <w:t xml:space="preserve">S. </w:t>
             </w:r>
-            <w:fldSimple w:instr="PAGEREF r23 \h">
+            <w:fldSimple w:instr="PAGEREF r21 \h">
               <w:r>
-                <w:t xml:space="preserve">29</w:t>
+                <w:t xml:space="preserve">28</w:t>
               </w:r>
             </w:fldSimple>
           </w:p>
@@ -19505,9 +19095,9 @@
               </w:rPr>
               <w:t xml:space="preserve">S. </w:t>
             </w:r>
-            <w:fldSimple w:instr="PAGEREF r25 \h">
+            <w:fldSimple w:instr="PAGEREF r23 \h">
               <w:r>
-                <w:t xml:space="preserve">31</w:t>
+                <w:t xml:space="preserve">30</w:t>
               </w:r>
             </w:fldSimple>
           </w:p>
@@ -19606,9 +19196,9 @@
               </w:rPr>
               <w:t xml:space="preserve">S. </w:t>
             </w:r>
-            <w:fldSimple w:instr="PAGEREF r26 \h">
+            <w:fldSimple w:instr="PAGEREF r24 \h">
               <w:r>
-                <w:t xml:space="preserve">31</w:t>
+                <w:t xml:space="preserve">30</w:t>
               </w:r>
             </w:fldSimple>
           </w:p>
@@ -19841,9 +19431,9 @@
               </w:rPr>
               <w:t xml:space="preserve">S. </w:t>
             </w:r>
-            <w:fldSimple w:instr="PAGEREF r31 \h">
+            <w:fldSimple w:instr="PAGEREF r29 \h">
               <w:r>
-                <w:t xml:space="preserve">36</w:t>
+                <w:t xml:space="preserve">35</w:t>
               </w:r>
             </w:fldSimple>
           </w:p>
@@ -19942,9 +19532,9 @@
               </w:rPr>
               <w:t xml:space="preserve">S. </w:t>
             </w:r>
-            <w:fldSimple w:instr="PAGEREF r32 \h">
+            <w:fldSimple w:instr="PAGEREF r30 \h">
               <w:r>
-                <w:t xml:space="preserve">36</w:t>
+                <w:t xml:space="preserve">35</w:t>
               </w:r>
             </w:fldSimple>
           </w:p>
@@ -20043,9 +19633,9 @@
               </w:rPr>
               <w:t xml:space="preserve">S. </w:t>
             </w:r>
-            <w:fldSimple w:instr="PAGEREF r30 \h">
+            <w:fldSimple w:instr="PAGEREF r28 \h">
               <w:r>
-                <w:t xml:space="preserve">35</w:t>
+                <w:t xml:space="preserve">34</w:t>
               </w:r>
             </w:fldSimple>
           </w:p>
@@ -20144,9 +19734,9 @@
               </w:rPr>
               <w:t xml:space="preserve">S. </w:t>
             </w:r>
-            <w:fldSimple w:instr="PAGEREF r28 \h">
+            <w:fldSimple w:instr="PAGEREF r26 \h">
               <w:r>
-                <w:t xml:space="preserve">34</w:t>
+                <w:t xml:space="preserve">33</w:t>
               </w:r>
             </w:fldSimple>
           </w:p>
@@ -20245,9 +19835,9 @@
               </w:rPr>
               <w:t xml:space="preserve">S. </w:t>
             </w:r>
-            <w:fldSimple w:instr="PAGEREF r29 \h">
+            <w:fldSimple w:instr="PAGEREF r27 \h">
               <w:r>
-                <w:t xml:space="preserve">34</w:t>
+                <w:t xml:space="preserve">33</w:t>
               </w:r>
             </w:fldSimple>
           </w:p>
@@ -20480,9 +20070,9 @@
               </w:rPr>
               <w:t xml:space="preserve">S. </w:t>
             </w:r>
-            <w:fldSimple w:instr="PAGEREF r34 \h">
+            <w:fldSimple w:instr="PAGEREF r32 \h">
               <w:r>
-                <w:t xml:space="preserve">37</w:t>
+                <w:t xml:space="preserve">36</w:t>
               </w:r>
             </w:fldSimple>
           </w:p>
@@ -20581,9 +20171,9 @@
               </w:rPr>
               <w:t xml:space="preserve">S. </w:t>
             </w:r>
-            <w:fldSimple w:instr="PAGEREF r36 \h">
+            <w:fldSimple w:instr="PAGEREF r34 \h">
               <w:r>
-                <w:t xml:space="preserve">38</w:t>
+                <w:t xml:space="preserve">37</w:t>
               </w:r>
             </w:fldSimple>
           </w:p>
@@ -20682,9 +20272,9 @@
               </w:rPr>
               <w:t xml:space="preserve">S. </w:t>
             </w:r>
-            <w:fldSimple w:instr="PAGEREF r33 \h">
+            <w:fldSimple w:instr="PAGEREF r31 \h">
               <w:r>
-                <w:t xml:space="preserve">37</w:t>
+                <w:t xml:space="preserve">36</w:t>
               </w:r>
             </w:fldSimple>
           </w:p>
@@ -20783,9 +20373,9 @@
               </w:rPr>
               <w:t xml:space="preserve">S. </w:t>
             </w:r>
-            <w:fldSimple w:instr="PAGEREF r35 \h">
+            <w:fldSimple w:instr="PAGEREF r33 \h">
               <w:r>
-                <w:t xml:space="preserve">38</w:t>
+                <w:t xml:space="preserve">37</w:t>
               </w:r>
             </w:fldSimple>
           </w:p>
@@ -21018,9 +20608,9 @@
               </w:rPr>
               <w:t xml:space="preserve">S. </w:t>
             </w:r>
-            <w:fldSimple w:instr="PAGEREF r39 \h">
+            <w:fldSimple w:instr="PAGEREF r37 \h">
               <w:r>
-                <w:t xml:space="preserve">40</w:t>
+                <w:t xml:space="preserve">39</w:t>
               </w:r>
             </w:fldSimple>
           </w:p>
@@ -21119,9 +20709,9 @@
               </w:rPr>
               <w:t xml:space="preserve">S. </w:t>
             </w:r>
-            <w:fldSimple w:instr="PAGEREF r38 \h">
+            <w:fldSimple w:instr="PAGEREF r36 \h">
               <w:r>
-                <w:t xml:space="preserve">39</w:t>
+                <w:t xml:space="preserve">38</w:t>
               </w:r>
             </w:fldSimple>
           </w:p>
@@ -21220,9 +20810,9 @@
               </w:rPr>
               <w:t xml:space="preserve">S. </w:t>
             </w:r>
-            <w:fldSimple w:instr="PAGEREF r37 \h">
+            <w:fldSimple w:instr="PAGEREF r35 \h">
               <w:r>
-                <w:t xml:space="preserve">39</w:t>
+                <w:t xml:space="preserve">38</w:t>
               </w:r>
             </w:fldSimple>
           </w:p>
@@ -21455,9 +21045,9 @@
               </w:rPr>
               <w:t xml:space="preserve">S. </w:t>
             </w:r>
-            <w:fldSimple w:instr="PAGEREF r40 \h">
+            <w:fldSimple w:instr="PAGEREF r38 \h">
               <w:r>
-                <w:t xml:space="preserve">41</w:t>
+                <w:t xml:space="preserve">40</w:t>
               </w:r>
             </w:fldSimple>
           </w:p>
@@ -21556,9 +21146,9 @@
               </w:rPr>
               <w:t xml:space="preserve">S. </w:t>
             </w:r>
-            <w:fldSimple w:instr="PAGEREF r41 \h">
+            <w:fldSimple w:instr="PAGEREF r39 \h">
               <w:r>
-                <w:t xml:space="preserve">42</w:t>
+                <w:t xml:space="preserve">41</w:t>
               </w:r>
             </w:fldSimple>
           </w:p>
@@ -22276,30 +21866,6 @@
     </w:lvl>
   </w:abstractNum>
   <w:abstractNum w:abstractNumId="43" w15:restartNumberingAfterBreak="0">
-    <w:multiLevelType w:val="hybridMultilevel"/>
-    <w:lvl w:ilvl="0" w15:tentative="1">
-      <w:start w:val="1"/>
-      <w:numFmt w:val="decimal"/>
-      <w:lvlText w:val="%1."/>
-      <w:lvlJc w:val="left"/>
-      <w:pPr>
-        <w:ind w:left="540" w:hanging="340"/>
-      </w:pPr>
-    </w:lvl>
-  </w:abstractNum>
-  <w:abstractNum w:abstractNumId="44" w15:restartNumberingAfterBreak="0">
-    <w:multiLevelType w:val="hybridMultilevel"/>
-    <w:lvl w:ilvl="0" w15:tentative="1">
-      <w:start w:val="1"/>
-      <w:numFmt w:val="decimal"/>
-      <w:lvlText w:val="%1."/>
-      <w:lvlJc w:val="left"/>
-      <w:pPr>
-        <w:ind w:left="540" w:hanging="340"/>
-      </w:pPr>
-    </w:lvl>
-  </w:abstractNum>
-  <w:abstractNum w:abstractNumId="45" w15:restartNumberingAfterBreak="0">
     <w:multiLevelType w:val="hybridMultilevel"/>
     <w:lvl w:ilvl="0" w15:tentative="1">
       <w:start w:val="1"/>
@@ -22569,18 +22135,6 @@
       <w:startOverride w:val="1"/>
     </w:lvlOverride>
   </w:num>
-  <w:num w:numId="44">
-    <w:abstractNumId w:val="44"/>
-    <w:lvlOverride w:ilvl="0">
-      <w:startOverride w:val="1"/>
-    </w:lvlOverride>
-  </w:num>
-  <w:num w:numId="45">
-    <w:abstractNumId w:val="45"/>
-    <w:lvlOverride w:ilvl="0">
-      <w:startOverride w:val="1"/>
-    </w:lvlOverride>
-  </w:num>
 </w:numbering>
 </file>
 

</xml_diff>

<commit_message>
Neue Reihe: Stück für Stück Selbstversorger, Heft 1 Der erste Gemüsegarten
Elf Kapitel von der Platzwahl bis zum Gartenjahr, rein pflanzlich gedüngt.
Impressum-Hinweis für Band 4, 5 und Heft 1 passend formuliert; Registertitel
und -spalte im Buchbauer einstellbar.

Co-Authored-By: Claude Opus 5.5 <noreply@anthropic.com>
Claude-Session: https://claude.ai/code/session_01Rqm6WzG9kWnhYjBnATSipi
</commit_message>
<xml_diff>
--- a/buecher/band-4-reinigung/Was-die-Natur-uns-schenkt-Band-4.docx
+++ b/buecher/band-4-reinigung/Was-die-Natur-uns-schenkt-Band-4.docx
@@ -195,7 +195,7 @@
           <w:sz w:val="18"/>
           <w:szCs w:val="18"/>
         </w:rPr>
-        <w:t xml:space="preserve">Texte und Pflanzenzeichnungen wurden mit Unterstützung künstlicher Intelligenz erstellt und von der Autorin überarbeitet.</w:t>
+        <w:t xml:space="preserve">Die Texte wurden mit Unterstützung künstlicher Intelligenz erstellt und von der Autorin überarbeitet.</w:t>
       </w:r>
     </w:p>
     <w:p>
@@ -223,7 +223,7 @@
           <w:sz w:val="18"/>
           <w:szCs w:val="18"/>
         </w:rPr>
-        <w:t xml:space="preserve"> Bitte beachte den Haftungsausschluss auf den folgenden Seiten. Die Inhalte dieses Buches wurden sorgfältig recherchiert. Sie dienen der allgemeinen Information und ersetzen keine ärztliche Beratung, Diagnose oder Behandlung. Wer Wildpflanzen sammelt und verwendet, tut dies auf eigene Verantwortung. Iss nie eine Pflanze, die du nicht zweifelsfrei bestimmt hast. Autorin und Verlag übernehmen keine Haftung für Schäden, die aus der Anwendung der beschriebenen Rezepte und Verfahren entstehen.</w:t>
+        <w:t xml:space="preserve"> Bitte beachte den Haftungsausschluss auf den folgenden Seiten. Die Inhalte dieses Buches wurden sorgfältig recherchiert. Sie dienen der allgemeinen Information. Wer die beschriebenen Mittel herstellt und anwendet, tut dies auf eigene Verantwortung. Autorin und Verlag übernehmen keine Haftung für Schäden, die aus der Anwendung der beschriebenen Anleitungen entstehen.</w:t>
       </w:r>
     </w:p>
     <w:p>
@@ -900,7 +900,7 @@
           <w:sz w:val="22"/>
           <w:szCs w:val="22"/>
         </w:rPr>
-        <w:t xml:space="preserve">Rezepte und Anwendungen nach Themen</w:t>
+        <w:t xml:space="preserve">Anleitungen nach Themen</w:t>
       </w:r>
       <w:r>
         <w:tab/>
@@ -14482,7 +14482,7 @@
       </w:pPr>
       <w:bookmarkStart w:name="t26" w:id="1"/>
       <w:r>
-        <w:t xml:space="preserve">Rezepte und Anwendungen nach Themen</w:t>
+        <w:t xml:space="preserve">Anleitungen nach Themen</w:t>
       </w:r>
       <w:bookmarkEnd w:id="1"/>
     </w:p>
@@ -14555,7 +14555,7 @@
                 <w:sz w:val="18"/>
                 <w:szCs w:val="18"/>
               </w:rPr>
-              <w:t xml:space="preserve">Rezept oder Anwendung</w:t>
+              <w:t xml:space="preserve">Anleitung</w:t>
             </w:r>
           </w:p>
         </w:tc>
@@ -16002,7 +16002,7 @@
                 <w:sz w:val="18"/>
                 <w:szCs w:val="18"/>
               </w:rPr>
-              <w:t xml:space="preserve">Rezept oder Anwendung</w:t>
+              <w:t xml:space="preserve">Anleitung</w:t>
             </w:r>
           </w:p>
         </w:tc>
@@ -16944,7 +16944,7 @@
                 <w:sz w:val="18"/>
                 <w:szCs w:val="18"/>
               </w:rPr>
-              <w:t xml:space="preserve">Rezept oder Anwendung</w:t>
+              <w:t xml:space="preserve">Anleitung</w:t>
             </w:r>
           </w:p>
         </w:tc>
@@ -17280,7 +17280,7 @@
                 <w:sz w:val="18"/>
                 <w:szCs w:val="18"/>
               </w:rPr>
-              <w:t xml:space="preserve">Rezept oder Anwendung</w:t>
+              <w:t xml:space="preserve">Anleitung</w:t>
             </w:r>
           </w:p>
         </w:tc>
@@ -18424,7 +18424,7 @@
                 <w:sz w:val="18"/>
                 <w:szCs w:val="18"/>
               </w:rPr>
-              <w:t xml:space="preserve">Rezept oder Anwendung</w:t>
+              <w:t xml:space="preserve">Anleitung</w:t>
             </w:r>
           </w:p>
         </w:tc>
@@ -19265,7 +19265,7 @@
                 <w:sz w:val="18"/>
                 <w:szCs w:val="18"/>
               </w:rPr>
-              <w:t xml:space="preserve">Rezept oder Anwendung</w:t>
+              <w:t xml:space="preserve">Anleitung</w:t>
             </w:r>
           </w:p>
         </w:tc>
@@ -19904,7 +19904,7 @@
                 <w:sz w:val="18"/>
                 <w:szCs w:val="18"/>
               </w:rPr>
-              <w:t xml:space="preserve">Rezept oder Anwendung</w:t>
+              <w:t xml:space="preserve">Anleitung</w:t>
             </w:r>
           </w:p>
         </w:tc>
@@ -20442,7 +20442,7 @@
                 <w:sz w:val="18"/>
                 <w:szCs w:val="18"/>
               </w:rPr>
-              <w:t xml:space="preserve">Rezept oder Anwendung</w:t>
+              <w:t xml:space="preserve">Anleitung</w:t>
             </w:r>
           </w:p>
         </w:tc>
@@ -20879,7 +20879,7 @@
                 <w:sz w:val="18"/>
                 <w:szCs w:val="18"/>
               </w:rPr>
-              <w:t xml:space="preserve">Rezept oder Anwendung</w:t>
+              <w:t xml:space="preserve">Anleitung</w:t>
             </w:r>
           </w:p>
         </w:tc>

</xml_diff>

<commit_message>
Impressum Diana Bittenbinder (Gardinen, Garten- und Selbstversorger-Bücher), Alles muss raus Band 2 Besenrein, neue ZIPs
Co-Authored-By: Claude Opus 5.5 <noreply@anthropic.com>
Claude-Session: https://claude.ai/code/session_01Rqm6WzG9kWnhYjBnATSipi
</commit_message>
<xml_diff>
--- a/buecher/band-4-reinigung/Was-die-Natur-uns-schenkt-Band-4.docx
+++ b/buecher/band-4-reinigung/Was-die-Natur-uns-schenkt-Band-4.docx
@@ -66,7 +66,7 @@
           <w:sz w:val="30"/>
           <w:szCs w:val="30"/>
         </w:rPr>
-        <w:t xml:space="preserve">Diana</w:t>
+        <w:t xml:space="preserve">Diana Bittenbinder</w:t>
       </w:r>
     </w:p>
     <w:p>
@@ -105,7 +105,7 @@
           <w:sz w:val="18"/>
           <w:szCs w:val="18"/>
         </w:rPr>
-        <w:t xml:space="preserve">© 2026 Diana [Nachname]. Alle Rechte vorbehalten.</w:t>
+        <w:t xml:space="preserve">© 2026 Diana Bittenbinder. Alle Rechte vorbehalten.</w:t>
       </w:r>
     </w:p>
     <w:p>
@@ -118,7 +118,7 @@
           <w:sz w:val="18"/>
           <w:szCs w:val="18"/>
         </w:rPr>
-        <w:t xml:space="preserve">Herausgeberin: Diana [Nachname], [Straße Hausnummer], [PLZ Ort]</w:t>
+        <w:t xml:space="preserve">Kontakt: info@svsger.de</w:t>
       </w:r>
     </w:p>
     <w:p>
@@ -131,71 +131,7 @@
           <w:sz w:val="18"/>
           <w:szCs w:val="18"/>
         </w:rPr>
-        <w:t xml:space="preserve">Kontakt: [E-Mail-Adresse]</w:t>
-      </w:r>
-    </w:p>
-    <w:p>
-      <w:pPr>
-        <w:spacing w:after="140" w:line="300"/>
-        <w:jc w:val="left"/>
-      </w:pPr>
-      <w:r>
-        <w:rPr>
-          <w:sz w:val="18"/>
-          <w:szCs w:val="18"/>
-        </w:rPr>
         <w:t xml:space="preserve">Website: svsger.de</w:t>
-      </w:r>
-    </w:p>
-    <w:p>
-      <w:pPr>
-        <w:spacing w:after="140" w:line="300"/>
-        <w:jc w:val="left"/>
-      </w:pPr>
-    </w:p>
-    <w:p>
-      <w:pPr>
-        <w:spacing w:after="140" w:line="300"/>
-        <w:jc w:val="left"/>
-      </w:pPr>
-      <w:r>
-        <w:rPr>
-          <w:sz w:val="18"/>
-          <w:szCs w:val="18"/>
-        </w:rPr>
-        <w:t xml:space="preserve">Druck und Vertrieb: [z. B. Amazon KDP / Independently published]</w:t>
-      </w:r>
-    </w:p>
-    <w:p>
-      <w:pPr>
-        <w:spacing w:after="140" w:line="300"/>
-        <w:jc w:val="left"/>
-      </w:pPr>
-      <w:r>
-        <w:rPr>
-          <w:sz w:val="18"/>
-          <w:szCs w:val="18"/>
-        </w:rPr>
-        <w:t xml:space="preserve">ISBN: [wird bei der Veröffentlichung vergeben]</w:t>
-      </w:r>
-    </w:p>
-    <w:p>
-      <w:pPr>
-        <w:spacing w:after="140" w:line="300"/>
-        <w:jc w:val="left"/>
-      </w:pPr>
-    </w:p>
-    <w:p>
-      <w:pPr>
-        <w:spacing w:after="140" w:line="300"/>
-        <w:jc w:val="left"/>
-      </w:pPr>
-      <w:r>
-        <w:rPr>
-          <w:sz w:val="18"/>
-          <w:szCs w:val="18"/>
-        </w:rPr>
-        <w:t xml:space="preserve">Die Texte wurden mit Unterstützung künstlicher Intelligenz erstellt und von der Autorin überarbeitet.</w:t>
       </w:r>
     </w:p>
     <w:p>

</xml_diff>